<commit_message>
Stage 1 revision: review items, design-variable/benchmark tables, Note S9 angle reset
- Methods: full stack and source handoff, near index matching, spline hemisphere,
  Table 1 (bounds and feasibility rules), EQE_total 0-90 deg, t statistic and Holm,
  usable-evaluation and trace-failure counts
- Results: Table 2 (benchmark entries and restart control), random-only collapse,
  per-band R^2, top-k stability, cavity-vs-lens share
- Discussion: depletion of favourable angles with Lambertian-reset test (Note S9),
  15% loss values, low-index ETL caveat, model-form uncertainty
- Supplement: Note S9, Table S10, Fig. S8, Tables S6a/S6b, corrected Note S4 source
- KO draft mirrored; md2optica adds Fig. S8; md2docx renders \tan

Co-Authored-By: Claude Opus 5.5 <noreply@anthropic.com>
Claude-Session: https://claude.ai/code/session_01YWogpr6EEdWobKwLNCqjUn
</commit_message>
<xml_diff>
--- a/Manuscript_EN.docx
+++ b/Manuscript_EN.docx
@@ -259,7 +259,22 @@
         <w:rPr>
           <w:rFonts w:ascii="Cambria" w:cs="Cambria" w:eastAsia="Cambria" w:hAnsi="Cambria"/>
         </w:rPr>
-        <w:t xml:space="preserve">, which serves as the source for three-dimensional ray tracing in LightTools, driven from MATLAB through the COM interface (Fig. 1). The stack is Al / ETL / EML / HTL / ITO / glass. With an Al cathode, light returned to the device loses about 13–16% per round trip [6], so the platform lies in the loss-limited regime where external structures reach EQEs near 55–60%. Section 4.3 discusses what this implies for the result. The emitting region is a disc of radius 1 mm, and the glass substrate is </w:t>
+        <w:t xml:space="preserve">, which serves as the source for three-dimensional ray tracing in LightTools, driven from MATLAB through the COM interface (Fig. 1). The stack is Al (100 nm) / B3PyMPM ETL / TCTA:B3PyMPM EML (25 nm) / TCTA (10 nm) / TAPC HTL / ITO (150 nm) / glass. The organic layers are birefringent, with measured ordinary and extraordinary indices, and Al and ITO use dispersive optical constants. The emitter is Ir(dmppy-ph)</w:t>
+      </w:r>
+      <w:r>
+        <w:rPr>
+          <w:rFonts w:ascii="Cambria" w:cs="Cambria" w:eastAsia="Cambria" w:hAnsi="Cambria"/>
+          <w:i/>
+          <w:iCs/>
+          <w:vertAlign w:val="subscript"/>
+        </w:rPr>
+        <w:t xml:space="preserve">2</w:t>
+      </w:r>
+      <w:r>
+        <w:rPr>
+          <w:rFonts w:ascii="Cambria" w:cs="Cambria" w:eastAsia="Cambria" w:hAnsi="Cambria"/>
+        </w:rPr>
+        <w:t xml:space="preserve">tmd, with a horizontal dipole ratio of 0.865, a radiative efficiency of 0.98, and the emission zone at the centre of the EML; the emission spectrum spans 453–753 nm. With an Al cathode and an ETL of index about 1.8, light returned to the device loses about 13–16% per round trip [6], so the platform lies in the loss-limited regime where external structures reach EQEs near 55–60%. Section 4.3 discusses what this implies for the result. The emitting region is a disc of radius 1 mm, and the glass substrate is </w:t>
       </w:r>
       <w:r>
         <w:rPr>
@@ -305,6 +320,162 @@
           <w:rFonts w:ascii="Cambria" w:cs="Cambria" w:eastAsia="Cambria" w:hAnsi="Cambria"/>
         </w:rPr>
         <w:t xml:space="preserve">. All CPS inputs are listed in Supplement 1, Note S1 (Table S1).</w:t>
+      </w:r>
+    </w:p>
+    <w:p>
+      <w:pPr>
+        <w:spacing w:after="140" w:line="276"/>
+        <w:jc w:val="both"/>
+      </w:pPr>
+      <w:r>
+        <w:rPr>
+          <w:rFonts w:ascii="Cambria" w:cs="Cambria" w:eastAsia="Cambria" w:hAnsi="Cambria"/>
+        </w:rPr>
+        <w:t xml:space="preserve">The CPS output is handed to the ray tracer one wavelength at a time. For each sampled wavelength, a 1 mm-radius disc source launches rays into the substrate with the polar distribution </w:t>
+      </w:r>
+      <w:r>
+        <w:rPr>
+          <w:rFonts w:ascii="Cambria" w:cs="Cambria" w:eastAsia="Cambria" w:hAnsi="Cambria"/>
+          <w:i/>
+          <w:iCs/>
+        </w:rPr>
+        <w:t xml:space="preserve">I</w:t>
+      </w:r>
+      <w:r>
+        <w:rPr>
+          <w:rFonts w:ascii="Cambria" w:cs="Cambria" w:eastAsia="Cambria" w:hAnsi="Cambria"/>
+          <w:i/>
+          <w:iCs/>
+          <w:vertAlign w:val="subscript"/>
+        </w:rPr>
+        <w:t xml:space="preserve">sub</w:t>
+      </w:r>
+      <w:r>
+        <w:rPr>
+          <w:rFonts w:ascii="Cambria" w:cs="Cambria" w:eastAsia="Cambria" w:hAnsi="Cambria"/>
+          <w:i/>
+          <w:iCs/>
+        </w:rPr>
+        <w:t xml:space="preserve">(θ) = (I</w:t>
+      </w:r>
+      <w:r>
+        <w:rPr>
+          <w:rFonts w:ascii="Cambria" w:cs="Cambria" w:eastAsia="Cambria" w:hAnsi="Cambria"/>
+          <w:i/>
+          <w:iCs/>
+          <w:vertAlign w:val="subscript"/>
+        </w:rPr>
+        <w:t xml:space="preserve">s</w:t>
+      </w:r>
+      <w:r>
+        <w:rPr>
+          <w:rFonts w:ascii="Cambria" w:cs="Cambria" w:eastAsia="Cambria" w:hAnsi="Cambria"/>
+          <w:i/>
+          <w:iCs/>
+        </w:rPr>
+        <w:t xml:space="preserve"> + I</w:t>
+      </w:r>
+      <w:r>
+        <w:rPr>
+          <w:rFonts w:ascii="Cambria" w:cs="Cambria" w:eastAsia="Cambria" w:hAnsi="Cambria"/>
+          <w:i/>
+          <w:iCs/>
+          <w:vertAlign w:val="subscript"/>
+        </w:rPr>
+        <w:t xml:space="preserve">p</w:t>
+      </w:r>
+      <w:r>
+        <w:rPr>
+          <w:rFonts w:ascii="Cambria" w:cs="Cambria" w:eastAsia="Cambria" w:hAnsi="Cambria"/>
+          <w:i/>
+          <w:iCs/>
+        </w:rPr>
+        <w:t xml:space="preserve">)/2</w:t>
+      </w:r>
+      <w:r>
+        <w:rPr>
+          <w:rFonts w:ascii="Cambria" w:cs="Cambria" w:eastAsia="Cambria" w:hAnsi="Cambria"/>
+        </w:rPr>
+        <w:t xml:space="preserve">, imposed by a 90-bin direction-grid apodizer and uniform in azimuth. The source power is set to </w:t>
+      </w:r>
+      <w:r>
+        <w:rPr>
+          <w:rFonts w:ascii="Cambria" w:cs="Cambria" w:eastAsia="Cambria" w:hAnsi="Cambria"/>
+          <w:i/>
+          <w:iCs/>
+        </w:rPr>
+        <w:t xml:space="preserve">∈t I</w:t>
+      </w:r>
+      <w:r>
+        <w:rPr>
+          <w:rFonts w:ascii="Cambria" w:cs="Cambria" w:eastAsia="Cambria" w:hAnsi="Cambria"/>
+          <w:i/>
+          <w:iCs/>
+          <w:vertAlign w:val="subscript"/>
+        </w:rPr>
+        <w:t xml:space="preserve">sub</w:t>
+      </w:r>
+      <w:r>
+        <w:rPr>
+          <w:rFonts w:ascii="Cambria" w:cs="Cambria" w:eastAsia="Cambria" w:hAnsi="Cambria"/>
+          <w:i/>
+          <w:iCs/>
+        </w:rPr>
+        <w:t xml:space="preserve">sinθ dθ</w:t>
+      </w:r>
+      <w:r>
+        <w:rPr>
+          <w:rFonts w:ascii="Cambria" w:cs="Cambria" w:eastAsia="Cambria" w:hAnsi="Cambria"/>
+        </w:rPr>
+        <w:t xml:space="preserve">. Light that the film returns to the device is reflected by a user coating on the device face, which carries the angle- and wavelength-resolved device reflectance </w:t>
+      </w:r>
+      <w:r>
+        <w:rPr>
+          <w:rFonts w:ascii="Cambria" w:cs="Cambria" w:eastAsia="Cambria" w:hAnsi="Cambria"/>
+          <w:i/>
+          <w:iCs/>
+        </w:rPr>
+        <w:t xml:space="preserve">(R</w:t>
+      </w:r>
+      <w:r>
+        <w:rPr>
+          <w:rFonts w:ascii="Cambria" w:cs="Cambria" w:eastAsia="Cambria" w:hAnsi="Cambria"/>
+          <w:i/>
+          <w:iCs/>
+          <w:vertAlign w:val="subscript"/>
+        </w:rPr>
+        <w:t xml:space="preserve">s</w:t>
+      </w:r>
+      <w:r>
+        <w:rPr>
+          <w:rFonts w:ascii="Cambria" w:cs="Cambria" w:eastAsia="Cambria" w:hAnsi="Cambria"/>
+          <w:i/>
+          <w:iCs/>
+        </w:rPr>
+        <w:t xml:space="preserve">+R</w:t>
+      </w:r>
+      <w:r>
+        <w:rPr>
+          <w:rFonts w:ascii="Cambria" w:cs="Cambria" w:eastAsia="Cambria" w:hAnsi="Cambria"/>
+          <w:i/>
+          <w:iCs/>
+          <w:vertAlign w:val="subscript"/>
+        </w:rPr>
+        <w:t xml:space="preserve">p</w:t>
+      </w:r>
+      <w:r>
+        <w:rPr>
+          <w:rFonts w:ascii="Cambria" w:cs="Cambria" w:eastAsia="Cambria" w:hAnsi="Cambria"/>
+          <w:i/>
+          <w:iCs/>
+        </w:rPr>
+        <w:t xml:space="preserve">)/2</w:t>
+      </w:r>
+      <w:r>
+        <w:rPr>
+          <w:rFonts w:ascii="Cambria" w:cs="Cambria" w:eastAsia="Cambria" w:hAnsi="Cambria"/>
+        </w:rPr>
+        <w:t xml:space="preserve"> computed by transfer matrices for the same stack. The total EQE is the sum over wavelengths of the traced extraction ratio multiplied by the CPS substrate-delivery efficiency at that wavelength. Polarization is therefore averaged both in the source and in the returned light. This is justified because rays in the substrate are reflected and refracted many times at the curved lens surfaces, which scrambles polarization, and because every class comparison uses the same treatment.</w:t>
       </w:r>
     </w:p>
     <w:p>
@@ -390,7 +561,44 @@
         <w:rPr>
           <w:rFonts w:ascii="Cambria" w:cs="Cambria" w:eastAsia="Cambria" w:hAnsi="Cambria"/>
         </w:rPr>
-        <w:t xml:space="preserve"> at 589 nm), index-matched to the substrate. The film/air boundary alone sets the escape condition. The lens index is held fixed throughout. It is a property of the platform here, not a design variable.</w:t>
+        <w:t xml:space="preserve"> at 589 nm), nearly index-matched to the substrate (</w:t>
+      </w:r>
+      <w:r>
+        <w:rPr>
+          <w:rFonts w:ascii="Cambria" w:cs="Cambria" w:eastAsia="Cambria" w:hAnsi="Cambria"/>
+          <w:i/>
+          <w:iCs/>
+        </w:rPr>
+        <w:t xml:space="preserve">Δ n = 0.007</w:t>
+      </w:r>
+      <w:r>
+        <w:rPr>
+          <w:rFonts w:ascii="Cambria" w:cs="Cambria" w:eastAsia="Cambria" w:hAnsi="Cambria"/>
+        </w:rPr>
+        <w:t xml:space="preserve">, which changes the interface reflectance by about </w:t>
+      </w:r>
+      <w:r>
+        <w:rPr>
+          <w:rFonts w:ascii="Cambria" w:cs="Cambria" w:eastAsia="Cambria" w:hAnsi="Cambria"/>
+          <w:i/>
+          <w:iCs/>
+        </w:rPr>
+        <w:t xml:space="preserve">10</w:t>
+      </w:r>
+      <w:r>
+        <w:rPr>
+          <w:rFonts w:ascii="Cambria" w:cs="Cambria" w:eastAsia="Cambria" w:hAnsi="Cambria"/>
+          <w:i/>
+          <w:iCs/>
+          <w:vertAlign w:val="superscript"/>
+        </w:rPr>
+        <w:t xml:space="preserve">-5</w:t>
+      </w:r>
+      <w:r>
+        <w:rPr>
+          <w:rFonts w:ascii="Cambria" w:cs="Cambria" w:eastAsia="Cambria" w:hAnsi="Cambria"/>
+        </w:rPr>
+        <w:t xml:space="preserve">). The film/air boundary therefore sets the escape condition. The lens index is held fixed throughout. It is a property of the platform here, not a design variable.</w:t>
       </w:r>
     </w:p>
     <w:p>
@@ -432,7 +640,21 @@
         <w:rPr>
           <w:rFonts w:ascii="Cambria" w:cs="Cambria" w:eastAsia="Cambria" w:hAnsi="Cambria"/>
         </w:rPr>
-        <w:t xml:space="preserve"> The profile is a fixed quarter circle. The lens height and the ETL and HTL thicknesses are free.</w:t>
+        <w:t xml:space="preserve"> The profile is the same spline with its five control points fixed on the quarter circle. It reproduces a true circle to within 0.007 lens radii for </w:t>
+      </w:r>
+      <w:r>
+        <w:rPr>
+          <w:rFonts w:ascii="Cambria" w:cs="Cambria" w:eastAsia="Cambria" w:hAnsi="Cambria"/>
+          <w:i/>
+          <w:iCs/>
+        </w:rPr>
+        <w:t xml:space="preserve">r &lt; 0.95</w:t>
+      </w:r>
+      <w:r>
+        <w:rPr>
+          <w:rFonts w:ascii="Cambria" w:cs="Cambria" w:eastAsia="Cambria" w:hAnsi="Cambria"/>
+        </w:rPr>
+        <w:t xml:space="preserve"> and 0.055 lens radii at the rim. The lens height and the ETL and HTL thicknesses are free.</w:t>
       </w:r>
     </w:p>
     <w:p>
@@ -474,7 +696,804 @@
         <w:rPr>
           <w:rFonts w:ascii="Cambria" w:cs="Cambria" w:eastAsia="Cambria" w:hAnsi="Cambria"/>
         </w:rPr>
-        <w:t xml:space="preserve">Both classes share the same material, pitch, fill factor, height range, and maximum draft angle. The hemisphere is a member of the freeform set. The freeform constraints are never more permissive than the hemisphere's, so any difference measures shape freedom alone. Cavity thicknesses are optimized together with the lens in every campaign, so each class is compared at its own best cavity. Candidates with self-intersection, negative thickness, or unmanufacturable draft angles are rejected before evaluation.</w:t>
+        <w:t xml:space="preserve">Both classes share the same material, pitch, fill factor, height range, and cavity bounds (Table 1). Because the hemispherical reference is the member of the spline family whose control points lie on the quarter circle, it is an exact point of the freeform design space. The freeform constraints are never more permissive than the hemisphere's, so any difference measures shape freedom alone. Cavity thicknesses are optimized together with the lens in every campaign, so each class is compared at its own best cavity.</w:t>
+      </w:r>
+    </w:p>
+    <w:p>
+      <w:pPr>
+        <w:spacing w:after="140" w:line="276"/>
+        <w:jc w:val="both"/>
+      </w:pPr>
+      <w:r>
+        <w:rPr>
+          <w:rFonts w:ascii="Cambria" w:cs="Cambria" w:eastAsia="Cambria" w:hAnsi="Cambria"/>
+          <w:b/>
+          <w:bCs/>
+        </w:rPr>
+        <w:t xml:space="preserve">Table 1 | Design variables, bounds, and feasibility rules.</w:t>
+      </w:r>
+    </w:p>
+    <w:tbl>
+      <w:tblPr>
+        <w:tblW w:type="pct" w:w="100%"/>
+        <w:tblBorders>
+          <w:top w:val="single" w:color="auto" w:sz="4"/>
+          <w:left w:val="single" w:color="auto" w:sz="4"/>
+          <w:bottom w:val="single" w:color="auto" w:sz="4"/>
+          <w:right w:val="single" w:color="auto" w:sz="4"/>
+          <w:insideH w:val="single" w:color="auto" w:sz="4"/>
+          <w:insideV w:val="single" w:color="auto" w:sz="4"/>
+        </w:tblBorders>
+      </w:tblPr>
+      <w:tblGrid>
+        <w:gridCol w:w="100"/>
+        <w:gridCol w:w="100"/>
+        <w:gridCol w:w="100"/>
+      </w:tblGrid>
+      <w:tr>
+        <w:trPr>
+          <w:tblHeader/>
+        </w:trPr>
+        <w:tc>
+          <w:tcPr>
+            <w:shd w:fill="DCE3EF" w:color="auto" w:val="clear"/>
+            <w:tcMar>
+              <w:top w:type="dxa" w:w="40"/>
+              <w:left w:type="dxa" w:w="80"/>
+              <w:bottom w:type="dxa" w:w="40"/>
+              <w:right w:type="dxa" w:w="80"/>
+            </w:tcMar>
+          </w:tcPr>
+          <w:p>
+            <w:r>
+              <w:rPr>
+                <w:rFonts w:ascii="Cambria" w:cs="Cambria" w:eastAsia="Cambria" w:hAnsi="Cambria"/>
+                <w:b/>
+                <w:bCs/>
+                <w:sz w:val="17"/>
+                <w:szCs w:val="17"/>
+              </w:rPr>
+              <w:t xml:space="preserve">Quantity</w:t>
+            </w:r>
+          </w:p>
+        </w:tc>
+        <w:tc>
+          <w:tcPr>
+            <w:shd w:fill="DCE3EF" w:color="auto" w:val="clear"/>
+            <w:tcMar>
+              <w:top w:type="dxa" w:w="40"/>
+              <w:left w:type="dxa" w:w="80"/>
+              <w:bottom w:type="dxa" w:w="40"/>
+              <w:right w:type="dxa" w:w="80"/>
+            </w:tcMar>
+          </w:tcPr>
+          <w:p>
+            <w:r>
+              <w:rPr>
+                <w:rFonts w:ascii="Cambria" w:cs="Cambria" w:eastAsia="Cambria" w:hAnsi="Cambria"/>
+                <w:b/>
+                <w:bCs/>
+                <w:sz w:val="17"/>
+                <w:szCs w:val="17"/>
+              </w:rPr>
+              <w:t xml:space="preserve">Freeform</w:t>
+            </w:r>
+          </w:p>
+        </w:tc>
+        <w:tc>
+          <w:tcPr>
+            <w:shd w:fill="DCE3EF" w:color="auto" w:val="clear"/>
+            <w:tcMar>
+              <w:top w:type="dxa" w:w="40"/>
+              <w:left w:type="dxa" w:w="80"/>
+              <w:bottom w:type="dxa" w:w="40"/>
+              <w:right w:type="dxa" w:w="80"/>
+            </w:tcMar>
+          </w:tcPr>
+          <w:p>
+            <w:r>
+              <w:rPr>
+                <w:rFonts w:ascii="Cambria" w:cs="Cambria" w:eastAsia="Cambria" w:hAnsi="Cambria"/>
+                <w:b/>
+                <w:bCs/>
+                <w:sz w:val="17"/>
+                <w:szCs w:val="17"/>
+              </w:rPr>
+              <w:t xml:space="preserve">Hemispherical reference</w:t>
+            </w:r>
+          </w:p>
+        </w:tc>
+      </w:tr>
+      <w:tr>
+        <w:trPr>
+          <w:tblHeader w:val="false"/>
+        </w:trPr>
+        <w:tc>
+          <w:tcPr>
+            <w:tcMar>
+              <w:top w:type="dxa" w:w="40"/>
+              <w:left w:type="dxa" w:w="80"/>
+              <w:bottom w:type="dxa" w:w="40"/>
+              <w:right w:type="dxa" w:w="80"/>
+            </w:tcMar>
+          </w:tcPr>
+          <w:p>
+            <w:r>
+              <w:rPr>
+                <w:rFonts w:ascii="Cambria" w:cs="Cambria" w:eastAsia="Cambria" w:hAnsi="Cambria"/>
+                <w:b w:val="false"/>
+                <w:bCs w:val="false"/>
+                <w:sz w:val="17"/>
+                <w:szCs w:val="17"/>
+              </w:rPr>
+              <w:t xml:space="preserve">Radial control points </w:t>
+            </w:r>
+            <w:r>
+              <w:rPr>
+                <w:rFonts w:ascii="Cambria" w:cs="Cambria" w:eastAsia="Cambria" w:hAnsi="Cambria"/>
+                <w:b w:val="false"/>
+                <w:bCs w:val="false"/>
+                <w:i/>
+                <w:iCs/>
+                <w:sz w:val="17"/>
+                <w:szCs w:val="17"/>
+              </w:rPr>
+              <w:t xml:space="preserve">x</w:t>
+            </w:r>
+            <w:r>
+              <w:rPr>
+                <w:rFonts w:ascii="Cambria" w:cs="Cambria" w:eastAsia="Cambria" w:hAnsi="Cambria"/>
+                <w:b w:val="false"/>
+                <w:bCs w:val="false"/>
+                <w:i/>
+                <w:iCs/>
+                <w:sz w:val="17"/>
+                <w:szCs w:val="17"/>
+                <w:vertAlign w:val="subscript"/>
+              </w:rPr>
+              <w:t xml:space="preserve">2</w:t>
+            </w:r>
+            <w:r>
+              <w:rPr>
+                <w:rFonts w:ascii="Cambria" w:cs="Cambria" w:eastAsia="Cambria" w:hAnsi="Cambria"/>
+                <w:b w:val="false"/>
+                <w:bCs w:val="false"/>
+                <w:sz w:val="17"/>
+                <w:szCs w:val="17"/>
+              </w:rPr>
+              <w:t xml:space="preserve">–</w:t>
+            </w:r>
+            <w:r>
+              <w:rPr>
+                <w:rFonts w:ascii="Cambria" w:cs="Cambria" w:eastAsia="Cambria" w:hAnsi="Cambria"/>
+                <w:b w:val="false"/>
+                <w:bCs w:val="false"/>
+                <w:i/>
+                <w:iCs/>
+                <w:sz w:val="17"/>
+                <w:szCs w:val="17"/>
+              </w:rPr>
+              <w:t xml:space="preserve">x</w:t>
+            </w:r>
+            <w:r>
+              <w:rPr>
+                <w:rFonts w:ascii="Cambria" w:cs="Cambria" w:eastAsia="Cambria" w:hAnsi="Cambria"/>
+                <w:b w:val="false"/>
+                <w:bCs w:val="false"/>
+                <w:i/>
+                <w:iCs/>
+                <w:sz w:val="17"/>
+                <w:szCs w:val="17"/>
+                <w:vertAlign w:val="subscript"/>
+              </w:rPr>
+              <w:t xml:space="preserve">6</w:t>
+            </w:r>
+            <w:r>
+              <w:rPr>
+                <w:rFonts w:ascii="Cambria" w:cs="Cambria" w:eastAsia="Cambria" w:hAnsi="Cambria"/>
+                <w:b w:val="false"/>
+                <w:bCs w:val="false"/>
+                <w:sz w:val="17"/>
+                <w:szCs w:val="17"/>
+              </w:rPr>
+              <w:t xml:space="preserve"> (lens radii)</w:t>
+            </w:r>
+          </w:p>
+        </w:tc>
+        <w:tc>
+          <w:tcPr>
+            <w:tcMar>
+              <w:top w:type="dxa" w:w="40"/>
+              <w:left w:type="dxa" w:w="80"/>
+              <w:bottom w:type="dxa" w:w="40"/>
+              <w:right w:type="dxa" w:w="80"/>
+            </w:tcMar>
+          </w:tcPr>
+          <w:p>
+            <w:r>
+              <w:rPr>
+                <w:rFonts w:ascii="Cambria" w:cs="Cambria" w:eastAsia="Cambria" w:hAnsi="Cambria"/>
+                <w:b w:val="false"/>
+                <w:bCs w:val="false"/>
+                <w:sz w:val="17"/>
+                <w:szCs w:val="17"/>
+              </w:rPr>
+              <w:t xml:space="preserve">0–1, sorted ascending</w:t>
+            </w:r>
+          </w:p>
+        </w:tc>
+        <w:tc>
+          <w:tcPr>
+            <w:tcMar>
+              <w:top w:type="dxa" w:w="40"/>
+              <w:left w:type="dxa" w:w="80"/>
+              <w:bottom w:type="dxa" w:w="40"/>
+              <w:right w:type="dxa" w:w="80"/>
+            </w:tcMar>
+          </w:tcPr>
+          <w:p>
+            <w:r>
+              <w:rPr>
+                <w:rFonts w:ascii="Cambria" w:cs="Cambria" w:eastAsia="Cambria" w:hAnsi="Cambria"/>
+                <w:b w:val="false"/>
+                <w:bCs w:val="false"/>
+                <w:sz w:val="17"/>
+                <w:szCs w:val="17"/>
+              </w:rPr>
+              <w:t xml:space="preserve">fixed on the quarter circle</w:t>
+            </w:r>
+          </w:p>
+        </w:tc>
+      </w:tr>
+      <w:tr>
+        <w:trPr>
+          <w:tblHeader w:val="false"/>
+        </w:trPr>
+        <w:tc>
+          <w:tcPr>
+            <w:tcMar>
+              <w:top w:type="dxa" w:w="40"/>
+              <w:left w:type="dxa" w:w="80"/>
+              <w:bottom w:type="dxa" w:w="40"/>
+              <w:right w:type="dxa" w:w="80"/>
+            </w:tcMar>
+          </w:tcPr>
+          <w:p>
+            <w:r>
+              <w:rPr>
+                <w:rFonts w:ascii="Cambria" w:cs="Cambria" w:eastAsia="Cambria" w:hAnsi="Cambria"/>
+                <w:b w:val="false"/>
+                <w:bCs w:val="false"/>
+                <w:sz w:val="17"/>
+                <w:szCs w:val="17"/>
+              </w:rPr>
+              <w:t xml:space="preserve">Height control points </w:t>
+            </w:r>
+            <w:r>
+              <w:rPr>
+                <w:rFonts w:ascii="Cambria" w:cs="Cambria" w:eastAsia="Cambria" w:hAnsi="Cambria"/>
+                <w:b w:val="false"/>
+                <w:bCs w:val="false"/>
+                <w:i/>
+                <w:iCs/>
+                <w:sz w:val="17"/>
+                <w:szCs w:val="17"/>
+              </w:rPr>
+              <w:t xml:space="preserve">y</w:t>
+            </w:r>
+            <w:r>
+              <w:rPr>
+                <w:rFonts w:ascii="Cambria" w:cs="Cambria" w:eastAsia="Cambria" w:hAnsi="Cambria"/>
+                <w:b w:val="false"/>
+                <w:bCs w:val="false"/>
+                <w:i/>
+                <w:iCs/>
+                <w:sz w:val="17"/>
+                <w:szCs w:val="17"/>
+                <w:vertAlign w:val="subscript"/>
+              </w:rPr>
+              <w:t xml:space="preserve">2</w:t>
+            </w:r>
+            <w:r>
+              <w:rPr>
+                <w:rFonts w:ascii="Cambria" w:cs="Cambria" w:eastAsia="Cambria" w:hAnsi="Cambria"/>
+                <w:b w:val="false"/>
+                <w:bCs w:val="false"/>
+                <w:sz w:val="17"/>
+                <w:szCs w:val="17"/>
+              </w:rPr>
+              <w:t xml:space="preserve">–</w:t>
+            </w:r>
+            <w:r>
+              <w:rPr>
+                <w:rFonts w:ascii="Cambria" w:cs="Cambria" w:eastAsia="Cambria" w:hAnsi="Cambria"/>
+                <w:b w:val="false"/>
+                <w:bCs w:val="false"/>
+                <w:i/>
+                <w:iCs/>
+                <w:sz w:val="17"/>
+                <w:szCs w:val="17"/>
+              </w:rPr>
+              <w:t xml:space="preserve">y</w:t>
+            </w:r>
+            <w:r>
+              <w:rPr>
+                <w:rFonts w:ascii="Cambria" w:cs="Cambria" w:eastAsia="Cambria" w:hAnsi="Cambria"/>
+                <w:b w:val="false"/>
+                <w:bCs w:val="false"/>
+                <w:i/>
+                <w:iCs/>
+                <w:sz w:val="17"/>
+                <w:szCs w:val="17"/>
+                <w:vertAlign w:val="subscript"/>
+              </w:rPr>
+              <w:t xml:space="preserve">6</w:t>
+            </w:r>
+            <w:r>
+              <w:rPr>
+                <w:rFonts w:ascii="Cambria" w:cs="Cambria" w:eastAsia="Cambria" w:hAnsi="Cambria"/>
+                <w:b w:val="false"/>
+                <w:bCs w:val="false"/>
+                <w:sz w:val="17"/>
+                <w:szCs w:val="17"/>
+              </w:rPr>
+              <w:t xml:space="preserve"> (lens radii)</w:t>
+            </w:r>
+          </w:p>
+        </w:tc>
+        <w:tc>
+          <w:tcPr>
+            <w:tcMar>
+              <w:top w:type="dxa" w:w="40"/>
+              <w:left w:type="dxa" w:w="80"/>
+              <w:bottom w:type="dxa" w:w="40"/>
+              <w:right w:type="dxa" w:w="80"/>
+            </w:tcMar>
+          </w:tcPr>
+          <w:p>
+            <w:r>
+              <w:rPr>
+                <w:rFonts w:ascii="Cambria" w:cs="Cambria" w:eastAsia="Cambria" w:hAnsi="Cambria"/>
+                <w:b w:val="false"/>
+                <w:bCs w:val="false"/>
+                <w:sz w:val="17"/>
+                <w:szCs w:val="17"/>
+              </w:rPr>
+              <w:t xml:space="preserve">0–1.5</w:t>
+            </w:r>
+          </w:p>
+        </w:tc>
+        <w:tc>
+          <w:tcPr>
+            <w:tcMar>
+              <w:top w:type="dxa" w:w="40"/>
+              <w:left w:type="dxa" w:w="80"/>
+              <w:bottom w:type="dxa" w:w="40"/>
+              <w:right w:type="dxa" w:w="80"/>
+            </w:tcMar>
+          </w:tcPr>
+          <w:p>
+            <w:r>
+              <w:rPr>
+                <w:rFonts w:ascii="Cambria" w:cs="Cambria" w:eastAsia="Cambria" w:hAnsi="Cambria"/>
+                <w:b w:val="false"/>
+                <w:bCs w:val="false"/>
+                <w:sz w:val="17"/>
+                <w:szCs w:val="17"/>
+              </w:rPr>
+              <w:t xml:space="preserve">fixed on the quarter circle</w:t>
+            </w:r>
+          </w:p>
+        </w:tc>
+      </w:tr>
+      <w:tr>
+        <w:trPr>
+          <w:tblHeader w:val="false"/>
+        </w:trPr>
+        <w:tc>
+          <w:tcPr>
+            <w:tcMar>
+              <w:top w:type="dxa" w:w="40"/>
+              <w:left w:type="dxa" w:w="80"/>
+              <w:bottom w:type="dxa" w:w="40"/>
+              <w:right w:type="dxa" w:w="80"/>
+            </w:tcMar>
+          </w:tcPr>
+          <w:p>
+            <w:r>
+              <w:rPr>
+                <w:rFonts w:ascii="Cambria" w:cs="Cambria" w:eastAsia="Cambria" w:hAnsi="Cambria"/>
+                <w:b w:val="false"/>
+                <w:bCs w:val="false"/>
+                <w:sz w:val="17"/>
+                <w:szCs w:val="17"/>
+              </w:rPr>
+              <w:t xml:space="preserve">End points</w:t>
+            </w:r>
+          </w:p>
+        </w:tc>
+        <w:tc>
+          <w:tcPr>
+            <w:tcMar>
+              <w:top w:type="dxa" w:w="40"/>
+              <w:left w:type="dxa" w:w="80"/>
+              <w:bottom w:type="dxa" w:w="40"/>
+              <w:right w:type="dxa" w:w="80"/>
+            </w:tcMar>
+          </w:tcPr>
+          <w:p>
+            <w:r>
+              <w:rPr>
+                <w:rFonts w:ascii="Cambria" w:cs="Cambria" w:eastAsia="Cambria" w:hAnsi="Cambria"/>
+                <w:b w:val="false"/>
+                <w:bCs w:val="false"/>
+                <w:sz w:val="17"/>
+                <w:szCs w:val="17"/>
+              </w:rPr>
+              <w:t xml:space="preserve">(0, 1) and (1, 0), fixed</w:t>
+            </w:r>
+          </w:p>
+        </w:tc>
+        <w:tc>
+          <w:tcPr>
+            <w:tcMar>
+              <w:top w:type="dxa" w:w="40"/>
+              <w:left w:type="dxa" w:w="80"/>
+              <w:bottom w:type="dxa" w:w="40"/>
+              <w:right w:type="dxa" w:w="80"/>
+            </w:tcMar>
+          </w:tcPr>
+          <w:p>
+            <w:r>
+              <w:rPr>
+                <w:rFonts w:ascii="Cambria" w:cs="Cambria" w:eastAsia="Cambria" w:hAnsi="Cambria"/>
+                <w:b w:val="false"/>
+                <w:bCs w:val="false"/>
+                <w:sz w:val="17"/>
+                <w:szCs w:val="17"/>
+              </w:rPr>
+              <w:t xml:space="preserve">same</w:t>
+            </w:r>
+          </w:p>
+        </w:tc>
+      </w:tr>
+      <w:tr>
+        <w:trPr>
+          <w:tblHeader w:val="false"/>
+        </w:trPr>
+        <w:tc>
+          <w:tcPr>
+            <w:tcMar>
+              <w:top w:type="dxa" w:w="40"/>
+              <w:left w:type="dxa" w:w="80"/>
+              <w:bottom w:type="dxa" w:w="40"/>
+              <w:right w:type="dxa" w:w="80"/>
+            </w:tcMar>
+          </w:tcPr>
+          <w:p>
+            <w:r>
+              <w:rPr>
+                <w:rFonts w:ascii="Cambria" w:cs="Cambria" w:eastAsia="Cambria" w:hAnsi="Cambria"/>
+                <w:b w:val="false"/>
+                <w:bCs w:val="false"/>
+                <w:sz w:val="17"/>
+                <w:szCs w:val="17"/>
+              </w:rPr>
+              <w:t xml:space="preserve">Height scale (stretch</w:t>
+            </w:r>
+            <w:r>
+              <w:rPr>
+                <w:rFonts w:ascii="Cambria" w:cs="Cambria" w:eastAsia="Cambria" w:hAnsi="Cambria"/>
+                <w:b w:val="false"/>
+                <w:bCs w:val="false"/>
+                <w:i/>
+                <w:iCs/>
+                <w:sz w:val="17"/>
+                <w:szCs w:val="17"/>
+                <w:vertAlign w:val="subscript"/>
+              </w:rPr>
+              <w:t xml:space="preserve">Z</w:t>
+            </w:r>
+            <w:r>
+              <w:rPr>
+                <w:rFonts w:ascii="Cambria" w:cs="Cambria" w:eastAsia="Cambria" w:hAnsi="Cambria"/>
+                <w:b w:val="false"/>
+                <w:bCs w:val="false"/>
+                <w:sz w:val="17"/>
+                <w:szCs w:val="17"/>
+              </w:rPr>
+              <w:t xml:space="preserve">)</w:t>
+            </w:r>
+          </w:p>
+        </w:tc>
+        <w:tc>
+          <w:tcPr>
+            <w:tcMar>
+              <w:top w:type="dxa" w:w="40"/>
+              <w:left w:type="dxa" w:w="80"/>
+              <w:bottom w:type="dxa" w:w="40"/>
+              <w:right w:type="dxa" w:w="80"/>
+            </w:tcMar>
+          </w:tcPr>
+          <w:p>
+            <w:r>
+              <w:rPr>
+                <w:rFonts w:ascii="Cambria" w:cs="Cambria" w:eastAsia="Cambria" w:hAnsi="Cambria"/>
+                <w:b w:val="false"/>
+                <w:bCs w:val="false"/>
+                <w:sz w:val="17"/>
+                <w:szCs w:val="17"/>
+              </w:rPr>
+              <w:t xml:space="preserve">0.1–3</w:t>
+            </w:r>
+          </w:p>
+        </w:tc>
+        <w:tc>
+          <w:tcPr>
+            <w:tcMar>
+              <w:top w:type="dxa" w:w="40"/>
+              <w:left w:type="dxa" w:w="80"/>
+              <w:bottom w:type="dxa" w:w="40"/>
+              <w:right w:type="dxa" w:w="80"/>
+            </w:tcMar>
+          </w:tcPr>
+          <w:p>
+            <w:r>
+              <w:rPr>
+                <w:rFonts w:ascii="Cambria" w:cs="Cambria" w:eastAsia="Cambria" w:hAnsi="Cambria"/>
+                <w:b w:val="false"/>
+                <w:bCs w:val="false"/>
+                <w:sz w:val="17"/>
+                <w:szCs w:val="17"/>
+              </w:rPr>
+              <w:t xml:space="preserve">0.1–3</w:t>
+            </w:r>
+          </w:p>
+        </w:tc>
+      </w:tr>
+      <w:tr>
+        <w:trPr>
+          <w:tblHeader w:val="false"/>
+        </w:trPr>
+        <w:tc>
+          <w:tcPr>
+            <w:tcMar>
+              <w:top w:type="dxa" w:w="40"/>
+              <w:left w:type="dxa" w:w="80"/>
+              <w:bottom w:type="dxa" w:w="40"/>
+              <w:right w:type="dxa" w:w="80"/>
+            </w:tcMar>
+          </w:tcPr>
+          <w:p>
+            <w:r>
+              <w:rPr>
+                <w:rFonts w:ascii="Cambria" w:cs="Cambria" w:eastAsia="Cambria" w:hAnsi="Cambria"/>
+                <w:b w:val="false"/>
+                <w:bCs w:val="false"/>
+                <w:sz w:val="17"/>
+                <w:szCs w:val="17"/>
+              </w:rPr>
+              <w:t xml:space="preserve">ETL and HTL thickness</w:t>
+            </w:r>
+          </w:p>
+        </w:tc>
+        <w:tc>
+          <w:tcPr>
+            <w:tcMar>
+              <w:top w:type="dxa" w:w="40"/>
+              <w:left w:type="dxa" w:w="80"/>
+              <w:bottom w:type="dxa" w:w="40"/>
+              <w:right w:type="dxa" w:w="80"/>
+            </w:tcMar>
+          </w:tcPr>
+          <w:p>
+            <w:r>
+              <w:rPr>
+                <w:rFonts w:ascii="Cambria" w:cs="Cambria" w:eastAsia="Cambria" w:hAnsi="Cambria"/>
+                <w:b w:val="false"/>
+                <w:bCs w:val="false"/>
+                <w:sz w:val="17"/>
+                <w:szCs w:val="17"/>
+              </w:rPr>
+              <w:t xml:space="preserve">10–150 nm each</w:t>
+            </w:r>
+          </w:p>
+        </w:tc>
+        <w:tc>
+          <w:tcPr>
+            <w:tcMar>
+              <w:top w:type="dxa" w:w="40"/>
+              <w:left w:type="dxa" w:w="80"/>
+              <w:bottom w:type="dxa" w:w="40"/>
+              <w:right w:type="dxa" w:w="80"/>
+            </w:tcMar>
+          </w:tcPr>
+          <w:p>
+            <w:r>
+              <w:rPr>
+                <w:rFonts w:ascii="Cambria" w:cs="Cambria" w:eastAsia="Cambria" w:hAnsi="Cambria"/>
+                <w:b w:val="false"/>
+                <w:bCs w:val="false"/>
+                <w:sz w:val="17"/>
+                <w:szCs w:val="17"/>
+              </w:rPr>
+              <w:t xml:space="preserve">10–150 nm each</w:t>
+            </w:r>
+          </w:p>
+        </w:tc>
+      </w:tr>
+      <w:tr>
+        <w:trPr>
+          <w:tblHeader w:val="false"/>
+        </w:trPr>
+        <w:tc>
+          <w:tcPr>
+            <w:tcMar>
+              <w:top w:type="dxa" w:w="40"/>
+              <w:left w:type="dxa" w:w="80"/>
+              <w:bottom w:type="dxa" w:w="40"/>
+              <w:right w:type="dxa" w:w="80"/>
+            </w:tcMar>
+          </w:tcPr>
+          <w:p>
+            <w:r>
+              <w:rPr>
+                <w:rFonts w:ascii="Cambria" w:cs="Cambria" w:eastAsia="Cambria" w:hAnsi="Cambria"/>
+                <w:b w:val="false"/>
+                <w:bCs w:val="false"/>
+                <w:sz w:val="17"/>
+                <w:szCs w:val="17"/>
+              </w:rPr>
+              <w:t xml:space="preserve">Feasibility rules</w:t>
+            </w:r>
+          </w:p>
+        </w:tc>
+        <w:tc>
+          <w:tcPr>
+            <w:tcMar>
+              <w:top w:type="dxa" w:w="40"/>
+              <w:left w:type="dxa" w:w="80"/>
+              <w:bottom w:type="dxa" w:w="40"/>
+              <w:right w:type="dxa" w:w="80"/>
+            </w:tcMar>
+          </w:tcPr>
+          <w:p>
+            <w:r>
+              <w:rPr>
+                <w:rFonts w:ascii="Cambria" w:cs="Cambria" w:eastAsia="Cambria" w:hAnsi="Cambria"/>
+                <w:b w:val="false"/>
+                <w:bCs w:val="false"/>
+                <w:sz w:val="17"/>
+                <w:szCs w:val="17"/>
+              </w:rPr>
+              <w:t xml:space="preserve">no self-intersection or collinear triples; control-point spacing 0.05–1.0; turning angle between adjacent segments ≤ 120°</w:t>
+            </w:r>
+          </w:p>
+        </w:tc>
+        <w:tc>
+          <w:tcPr>
+            <w:tcMar>
+              <w:top w:type="dxa" w:w="40"/>
+              <w:left w:type="dxa" w:w="80"/>
+              <w:bottom w:type="dxa" w:w="40"/>
+              <w:right w:type="dxa" w:w="80"/>
+            </w:tcMar>
+          </w:tcPr>
+          <w:p>
+            <w:r>
+              <w:rPr>
+                <w:rFonts w:ascii="Cambria" w:cs="Cambria" w:eastAsia="Cambria" w:hAnsi="Cambria"/>
+                <w:b w:val="false"/>
+                <w:bCs w:val="false"/>
+                <w:sz w:val="17"/>
+                <w:szCs w:val="17"/>
+              </w:rPr>
+              <w:t xml:space="preserve">always satisfied</w:t>
+            </w:r>
+          </w:p>
+        </w:tc>
+      </w:tr>
+      <w:tr>
+        <w:trPr>
+          <w:tblHeader w:val="false"/>
+        </w:trPr>
+        <w:tc>
+          <w:tcPr>
+            <w:tcMar>
+              <w:top w:type="dxa" w:w="40"/>
+              <w:left w:type="dxa" w:w="80"/>
+              <w:bottom w:type="dxa" w:w="40"/>
+              <w:right w:type="dxa" w:w="80"/>
+            </w:tcMar>
+          </w:tcPr>
+          <w:p>
+            <w:r>
+              <w:rPr>
+                <w:rFonts w:ascii="Cambria" w:cs="Cambria" w:eastAsia="Cambria" w:hAnsi="Cambria"/>
+                <w:b w:val="false"/>
+                <w:bCs w:val="false"/>
+                <w:sz w:val="17"/>
+                <w:szCs w:val="17"/>
+              </w:rPr>
+              <w:t xml:space="preserve">Free variables</w:t>
+            </w:r>
+          </w:p>
+        </w:tc>
+        <w:tc>
+          <w:tcPr>
+            <w:tcMar>
+              <w:top w:type="dxa" w:w="40"/>
+              <w:left w:type="dxa" w:w="80"/>
+              <w:bottom w:type="dxa" w:w="40"/>
+              <w:right w:type="dxa" w:w="80"/>
+            </w:tcMar>
+          </w:tcPr>
+          <w:p>
+            <w:r>
+              <w:rPr>
+                <w:rFonts w:ascii="Cambria" w:cs="Cambria" w:eastAsia="Cambria" w:hAnsi="Cambria"/>
+                <w:b w:val="false"/>
+                <w:bCs w:val="false"/>
+                <w:sz w:val="17"/>
+                <w:szCs w:val="17"/>
+              </w:rPr>
+              <w:t xml:space="preserve">13</w:t>
+            </w:r>
+          </w:p>
+        </w:tc>
+        <w:tc>
+          <w:tcPr>
+            <w:tcMar>
+              <w:top w:type="dxa" w:w="40"/>
+              <w:left w:type="dxa" w:w="80"/>
+              <w:bottom w:type="dxa" w:w="40"/>
+              <w:right w:type="dxa" w:w="80"/>
+            </w:tcMar>
+          </w:tcPr>
+          <w:p>
+            <w:r>
+              <w:rPr>
+                <w:rFonts w:ascii="Cambria" w:cs="Cambria" w:eastAsia="Cambria" w:hAnsi="Cambria"/>
+                <w:b w:val="false"/>
+                <w:bCs w:val="false"/>
+                <w:sz w:val="17"/>
+                <w:szCs w:val="17"/>
+              </w:rPr>
+              <w:t xml:space="preserve">3</w:t>
+            </w:r>
+          </w:p>
+        </w:tc>
+      </w:tr>
+    </w:tbl>
+    <w:p>
+      <w:pPr>
+        <w:spacing w:after="120"/>
+      </w:pPr>
+    </w:p>
+    <w:p>
+      <w:pPr>
+        <w:spacing w:after="140" w:line="276"/>
+        <w:jc w:val="both"/>
+      </w:pPr>
+      <w:r>
+        <w:rPr>
+          <w:rFonts w:ascii="Cambria" w:cs="Cambria" w:eastAsia="Cambria" w:hAnsi="Cambria"/>
+        </w:rPr>
+        <w:t xml:space="preserve">Candidates that violate a feasibility rule are not traced. They are returned to the optimizer as infeasible, so that </w:t>
+      </w:r>
+      <w:r>
+        <w:rPr>
+          <w:rFonts w:ascii="Consolas" w:cs="Consolas" w:eastAsia="Consolas" w:hAnsi="Consolas"/>
+          <w:sz w:val="18"/>
+          <w:szCs w:val="18"/>
+        </w:rPr>
+        <w:t xml:space="preserve">surrogateopt</w:t>
+      </w:r>
+      <w:r>
+        <w:rPr>
+          <w:rFonts w:ascii="Cambria" w:cs="Cambria" w:eastAsia="Cambria" w:hAnsi="Cambria"/>
+        </w:rPr>
+        <w:t xml:space="preserve"> learns the feasible region.</w:t>
       </w:r>
     </w:p>
     <w:p>
@@ -503,7 +1522,30 @@
         <w:rPr>
           <w:rFonts w:ascii="Cambria" w:cs="Cambria" w:eastAsia="Cambria" w:hAnsi="Cambria"/>
         </w:rPr>
-        <w:t xml:space="preserve">The far field is divided into four polar bands over the full azimuth: 0–20°, 20–40°, 40–60°, and 60–80°. The band EQE, </w:t>
+        <w:t xml:space="preserve">The total EQE, </w:t>
+      </w:r>
+      <w:r>
+        <w:rPr>
+          <w:rFonts w:ascii="Cambria" w:cs="Cambria" w:eastAsia="Cambria" w:hAnsi="Cambria"/>
+          <w:i/>
+          <w:iCs/>
+        </w:rPr>
+        <w:t xml:space="preserve">EQE</w:t>
+      </w:r>
+      <w:r>
+        <w:rPr>
+          <w:rFonts w:ascii="Cambria" w:cs="Cambria" w:eastAsia="Cambria" w:hAnsi="Cambria"/>
+          <w:i/>
+          <w:iCs/>
+          <w:vertAlign w:val="subscript"/>
+        </w:rPr>
+        <w:t xml:space="preserve">total</w:t>
+      </w:r>
+      <w:r>
+        <w:rPr>
+          <w:rFonts w:ascii="Cambria" w:cs="Cambria" w:eastAsia="Cambria" w:hAnsi="Cambria"/>
+        </w:rPr>
+        <w:t xml:space="preserve">, counts all photons emitted into air over the full hemisphere (0–90°). The far field is divided into four polar bands over the full azimuth: 0–20°, 20–40°, 40–60°, and 60–80°. The band EQE, </w:t>
       </w:r>
       <w:r>
         <w:rPr>
@@ -631,7 +1673,7 @@
         <w:rPr>
           <w:rFonts w:ascii="Cambria" w:cs="Cambria" w:eastAsia="Cambria" w:hAnsi="Cambria"/>
         </w:rPr>
-        <w:t xml:space="preserve">As an analytic reference we use the Lambertian partition </w:t>
+        <w:t xml:space="preserve">The four selectivities therefore sum to slightly less than one. The 80–90° remainder is 3.1% of the output for the median design (2.1–8.2% over all designs) and falls as efficiency rises; normalizing the bands to 0–80° instead changes none of the conclusions (Note S4). As an analytic reference we use the Lambertian partition </w:t>
       </w:r>
       <w:r>
         <w:rPr>
@@ -836,7 +1878,7 @@
         <w:rPr>
           <w:rFonts w:ascii="Cambria" w:cs="Cambria" w:eastAsia="Cambria" w:hAnsi="Cambria"/>
         </w:rPr>
-        <w:t xml:space="preserve">Each maximum is the mean of three high-precision re-evaluations of the best design. Because the hemisphere lies inside the freeform set, </w:t>
+        <w:t xml:space="preserve">Each maximum is the mean of three high-precision re-evaluations of the best design. Because the hemispherical reference is a point of the freeform design space, </w:t>
       </w:r>
       <w:r>
         <w:rPr>
@@ -1073,7 +2115,30 @@
         <w:rPr>
           <w:rFonts w:ascii="Cambria" w:cs="Cambria" w:eastAsia="Cambria" w:hAnsi="Cambria"/>
         </w:rPr>
-        <w:t xml:space="preserve">Searches use 10,000 rays and 31 wavelengths. Every reported optimum is re-evaluated three times with 50,000 rays and 151 wavelengths. Budgets for every campaign are listed in Supplement 1, Table S2.</w:t>
+        <w:t xml:space="preserve">Searches use 10,000 rays and 31 wavelengths. Every reported optimum is re-evaluated three times with 50,000 rays and 151 wavelengths; the standard deviation of a re-evaluated EQE is about </w:t>
+      </w:r>
+      <w:r>
+        <w:rPr>
+          <w:rFonts w:ascii="Cambria" w:cs="Cambria" w:eastAsia="Cambria" w:hAnsi="Cambria"/>
+          <w:i/>
+          <w:iCs/>
+        </w:rPr>
+        <w:t xml:space="preserve">10</w:t>
+      </w:r>
+      <w:r>
+        <w:rPr>
+          <w:rFonts w:ascii="Cambria" w:cs="Cambria" w:eastAsia="Cambria" w:hAnsi="Cambria"/>
+          <w:i/>
+          <w:iCs/>
+          <w:vertAlign w:val="superscript"/>
+        </w:rPr>
+        <w:t xml:space="preserve">-4</w:t>
+      </w:r>
+      <w:r>
+        <w:rPr>
+          <w:rFonts w:ascii="Cambria" w:cs="Cambria" w:eastAsia="Cambria" w:hAnsi="Cambria"/>
+        </w:rPr>
+        <w:t xml:space="preserve">. Budgets, trace counts, and failure rates for every campaign are listed in Supplement 1, Table S2. An evaluation counts as usable when the trace returns a positive total EQE; no other filtering is applied. Of the 691 logged evaluations of the weighted-sum campaign, 606 are usable (114 of the 150 random designs). Trace failures occurred in 10.5% of the freeform per-band evaluations and in none of the hemisphere evaluations.</w:t>
       </w:r>
     </w:p>
     <w:p>
@@ -1085,21 +2150,66 @@
         <w:rPr>
           <w:rFonts w:ascii="Cambria" w:cs="Cambria" w:eastAsia="Cambria" w:hAnsi="Cambria"/>
         </w:rPr>
-        <w:t xml:space="preserve">A search that misses part of its own design space could report a false absence of gain. To exclude this, we ran a restart control. For each objective, the search was restarted from that objective's hemispherical optimum, using the identical objective, constraints, and fidelities. The hemisphere point and eight perturbations within 8% of each variable's range were placed in the seed set. A pattern search was also launched directly from the hemisphere point. The hemisphere baseline was re-measured in the same session. An objective counts as improved when the gain exceeds the pooled one-sided 95% threshold, </w:t>
-      </w:r>
-      <w:r>
-        <w:rPr>
-          <w:rFonts w:ascii="Cambria" w:cs="Cambria" w:eastAsia="Cambria" w:hAnsi="Cambria"/>
-          <w:i/>
-          <w:iCs/>
-        </w:rPr>
-        <w:t xml:space="preserve">t = 2.13</w:t>
-      </w:r>
-      <w:r>
-        <w:rPr>
-          <w:rFonts w:ascii="Cambria" w:cs="Cambria" w:eastAsia="Cambria" w:hAnsi="Cambria"/>
-        </w:rPr>
-        <w:t xml:space="preserve"> at four degrees of freedom. The control is biased toward reporting a gain, because the winner is the maximum over many noisy evaluations. A null result under it is therefore conservative (Supplement 1, Note S2).</w:t>
+        <w:t xml:space="preserve">A search that misses part of its own design space could report a false absence of gain. To exclude this, we ran a restart control. For each objective, the search was restarted from that objective's hemispherical optimum, using the identical objective, constraints, and fidelities. The hemisphere point and eight perturbations within 8% of each variable's range were placed in the seed set. A pattern search was also launched directly from the hemisphere point. The hemisphere baseline was re-measured in the same session. The test statistic is the absolute difference of the two means divided by its pooled standard error, </w:t>
+      </w:r>
+      <w:r>
+        <w:rPr>
+          <w:rFonts w:ascii="Cambria" w:cs="Cambria" w:eastAsia="Cambria" w:hAnsi="Cambria"/>
+          <w:i/>
+          <w:iCs/>
+        </w:rPr>
+        <w:t xml:space="preserve">t = Δ/(s</w:t>
+      </w:r>
+      <w:r>
+        <w:rPr>
+          <w:rFonts w:ascii="Cambria" w:cs="Cambria" w:eastAsia="Cambria" w:hAnsi="Cambria"/>
+          <w:i/>
+          <w:iCs/>
+          <w:vertAlign w:val="subscript"/>
+        </w:rPr>
+        <w:t xml:space="preserve">p</w:t>
+      </w:r>
+      <w:r>
+        <w:rPr>
+          <w:rFonts w:ascii="Cambria" w:cs="Cambria" w:eastAsia="Cambria" w:hAnsi="Cambria"/>
+          <w:i/>
+          <w:iCs/>
+        </w:rPr>
+        <w:t xml:space="preserve">2/n)</w:t>
+      </w:r>
+      <w:r>
+        <w:rPr>
+          <w:rFonts w:ascii="Cambria" w:cs="Cambria" w:eastAsia="Cambria" w:hAnsi="Cambria"/>
+        </w:rPr>
+        <w:t xml:space="preserve"> with </w:t>
+      </w:r>
+      <w:r>
+        <w:rPr>
+          <w:rFonts w:ascii="Cambria" w:cs="Cambria" w:eastAsia="Cambria" w:hAnsi="Cambria"/>
+          <w:i/>
+          <w:iCs/>
+        </w:rPr>
+        <w:t xml:space="preserve">n = 3</w:t>
+      </w:r>
+      <w:r>
+        <w:rPr>
+          <w:rFonts w:ascii="Cambria" w:cs="Cambria" w:eastAsia="Cambria" w:hAnsi="Cambria"/>
+        </w:rPr>
+        <w:t xml:space="preserve"> repeats per design. An objective counts as improved when </w:t>
+      </w:r>
+      <w:r>
+        <w:rPr>
+          <w:rFonts w:ascii="Cambria" w:cs="Cambria" w:eastAsia="Cambria" w:hAnsi="Cambria"/>
+          <w:i/>
+          <w:iCs/>
+        </w:rPr>
+        <w:t xml:space="preserve">t</w:t>
+      </w:r>
+      <w:r>
+        <w:rPr>
+          <w:rFonts w:ascii="Cambria" w:cs="Cambria" w:eastAsia="Cambria" w:hAnsi="Cambria"/>
+        </w:rPr>
+        <w:t xml:space="preserve"> exceeds the one-sided 95% threshold, 2.13 at four degrees of freedom. The three large effects reported below remain significant under a Holm correction for the five objectives (step-wise thresholds 2.78–3.75). The one borderline case was re-measured with five repeats per design (threshold 1.86 at eight degrees of freedom). The control is biased toward reporting a gain, because the winner is the maximum over many noisy evaluations. A null result under it is therefore conservative (Supplement 1, Note S2).</w:t>
       </w:r>
     </w:p>
     <w:p>
@@ -1578,6 +2688,1070 @@
         <w:rPr>
           <w:rFonts w:ascii="Cambria" w:cs="Cambria" w:eastAsia="Cambria" w:hAnsi="Cambria"/>
         </w:rPr>
+        <w:t xml:space="preserve">Table 2 collects every entry behind these numbers. Two different quantities appear in it, and they should not be confused. </w:t>
+      </w:r>
+      <w:r>
+        <w:rPr>
+          <w:rFonts w:ascii="Cambria" w:cs="Cambria" w:eastAsia="Cambria" w:hAnsi="Cambria"/>
+          <w:i/>
+          <w:iCs/>
+        </w:rPr>
+        <w:t xml:space="preserve">G</w:t>
+      </w:r>
+      <w:r>
+        <w:rPr>
+          <w:rFonts w:ascii="Cambria" w:cs="Cambria" w:eastAsia="Cambria" w:hAnsi="Cambria"/>
+          <w:i/>
+          <w:iCs/>
+          <w:vertAlign w:val="subscript"/>
+        </w:rPr>
+        <w:t xml:space="preserve">j</w:t>
+      </w:r>
+      <w:r>
+        <w:rPr>
+          <w:rFonts w:ascii="Cambria" w:cs="Cambria" w:eastAsia="Cambria" w:hAnsi="Cambria"/>
+        </w:rPr>
+        <w:t xml:space="preserve"> compares the best freeform design of any matched campaign with the archived hemisphere optimum. The restart gain compares, within one session, the restarted design with a re-measured hemisphere. For 40–60° the two give 1.070 and +4.70%, because the per-band campaign found a better freeform design (0.19802) than the restart did (0.19355).</w:t>
+      </w:r>
+    </w:p>
+    <w:p>
+      <w:pPr>
+        <w:spacing w:after="140" w:line="276"/>
+        <w:jc w:val="both"/>
+      </w:pPr>
+      <w:r>
+        <w:rPr>
+          <w:rFonts w:ascii="Cambria" w:cs="Cambria" w:eastAsia="Cambria" w:hAnsi="Cambria"/>
+          <w:b/>
+          <w:bCs/>
+        </w:rPr>
+        <w:t xml:space="preserve">Table 2 | Freeform versus hemisphere for each objective.</w:t>
+      </w:r>
+    </w:p>
+    <w:tbl>
+      <w:tblPr>
+        <w:tblW w:type="pct" w:w="100%"/>
+        <w:tblBorders>
+          <w:top w:val="single" w:color="auto" w:sz="4"/>
+          <w:left w:val="single" w:color="auto" w:sz="4"/>
+          <w:bottom w:val="single" w:color="auto" w:sz="4"/>
+          <w:right w:val="single" w:color="auto" w:sz="4"/>
+          <w:insideH w:val="single" w:color="auto" w:sz="4"/>
+          <w:insideV w:val="single" w:color="auto" w:sz="4"/>
+        </w:tblBorders>
+      </w:tblPr>
+      <w:tblGrid>
+        <w:gridCol w:w="100"/>
+        <w:gridCol w:w="100"/>
+        <w:gridCol w:w="100"/>
+        <w:gridCol w:w="100"/>
+        <w:gridCol w:w="100"/>
+        <w:gridCol w:w="100"/>
+        <w:gridCol w:w="100"/>
+      </w:tblGrid>
+      <w:tr>
+        <w:trPr>
+          <w:tblHeader/>
+        </w:trPr>
+        <w:tc>
+          <w:tcPr>
+            <w:shd w:fill="DCE3EF" w:color="auto" w:val="clear"/>
+            <w:tcMar>
+              <w:top w:type="dxa" w:w="40"/>
+              <w:left w:type="dxa" w:w="80"/>
+              <w:bottom w:type="dxa" w:w="40"/>
+              <w:right w:type="dxa" w:w="80"/>
+            </w:tcMar>
+          </w:tcPr>
+          <w:p>
+            <w:r>
+              <w:rPr>
+                <w:rFonts w:ascii="Cambria" w:cs="Cambria" w:eastAsia="Cambria" w:hAnsi="Cambria"/>
+                <w:b/>
+                <w:bCs/>
+                <w:sz w:val="17"/>
+                <w:szCs w:val="17"/>
+              </w:rPr>
+              <w:t xml:space="preserve">Objective</w:t>
+            </w:r>
+          </w:p>
+        </w:tc>
+        <w:tc>
+          <w:tcPr>
+            <w:shd w:fill="DCE3EF" w:color="auto" w:val="clear"/>
+            <w:tcMar>
+              <w:top w:type="dxa" w:w="40"/>
+              <w:left w:type="dxa" w:w="80"/>
+              <w:bottom w:type="dxa" w:w="40"/>
+              <w:right w:type="dxa" w:w="80"/>
+            </w:tcMar>
+          </w:tcPr>
+          <w:p>
+            <w:r>
+              <w:rPr>
+                <w:rFonts w:ascii="Cambria" w:cs="Cambria" w:eastAsia="Cambria" w:hAnsi="Cambria"/>
+                <w:b/>
+                <w:bCs/>
+                <w:sz w:val="17"/>
+                <w:szCs w:val="17"/>
+              </w:rPr>
+              <w:t xml:space="preserve">Hemisphere (archived)</w:t>
+            </w:r>
+          </w:p>
+        </w:tc>
+        <w:tc>
+          <w:tcPr>
+            <w:shd w:fill="DCE3EF" w:color="auto" w:val="clear"/>
+            <w:tcMar>
+              <w:top w:type="dxa" w:w="40"/>
+              <w:left w:type="dxa" w:w="80"/>
+              <w:bottom w:type="dxa" w:w="40"/>
+              <w:right w:type="dxa" w:w="80"/>
+            </w:tcMar>
+          </w:tcPr>
+          <w:p>
+            <w:r>
+              <w:rPr>
+                <w:rFonts w:ascii="Cambria" w:cs="Cambria" w:eastAsia="Cambria" w:hAnsi="Cambria"/>
+                <w:b/>
+                <w:bCs/>
+                <w:sz w:val="17"/>
+                <w:szCs w:val="17"/>
+              </w:rPr>
+              <w:t xml:space="preserve">Best freeform</w:t>
+            </w:r>
+          </w:p>
+        </w:tc>
+        <w:tc>
+          <w:tcPr>
+            <w:shd w:fill="DCE3EF" w:color="auto" w:val="clear"/>
+            <w:tcMar>
+              <w:top w:type="dxa" w:w="40"/>
+              <w:left w:type="dxa" w:w="80"/>
+              <w:bottom w:type="dxa" w:w="40"/>
+              <w:right w:type="dxa" w:w="80"/>
+            </w:tcMar>
+          </w:tcPr>
+          <w:p>
+            <w:r>
+              <w:rPr>
+                <w:rFonts w:ascii="Cambria" w:cs="Cambria" w:eastAsia="Cambria" w:hAnsi="Cambria"/>
+                <w:b/>
+                <w:bCs/>
+                <w:sz w:val="17"/>
+                <w:szCs w:val="17"/>
+              </w:rPr>
+              <w:t xml:space="preserve">Source of freeform entry</w:t>
+            </w:r>
+          </w:p>
+        </w:tc>
+        <w:tc>
+          <w:tcPr>
+            <w:shd w:fill="DCE3EF" w:color="auto" w:val="clear"/>
+            <w:tcMar>
+              <w:top w:type="dxa" w:w="40"/>
+              <w:left w:type="dxa" w:w="80"/>
+              <w:bottom w:type="dxa" w:w="40"/>
+              <w:right w:type="dxa" w:w="80"/>
+            </w:tcMar>
+          </w:tcPr>
+          <w:p>
+            <w:r>
+              <w:rPr>
+                <w:rFonts w:ascii="Cambria" w:cs="Cambria" w:eastAsia="Cambria" w:hAnsi="Cambria"/>
+                <w:b/>
+                <w:bCs/>
+                <w:i/>
+                <w:iCs/>
+                <w:sz w:val="17"/>
+                <w:szCs w:val="17"/>
+              </w:rPr>
+              <w:t xml:space="preserve">G</w:t>
+            </w:r>
+            <w:r>
+              <w:rPr>
+                <w:rFonts w:ascii="Cambria" w:cs="Cambria" w:eastAsia="Cambria" w:hAnsi="Cambria"/>
+                <w:b/>
+                <w:bCs/>
+                <w:i/>
+                <w:iCs/>
+                <w:sz w:val="17"/>
+                <w:szCs w:val="17"/>
+                <w:vertAlign w:val="subscript"/>
+              </w:rPr>
+              <w:t xml:space="preserve">j</w:t>
+            </w:r>
+          </w:p>
+        </w:tc>
+        <w:tc>
+          <w:tcPr>
+            <w:shd w:fill="DCE3EF" w:color="auto" w:val="clear"/>
+            <w:tcMar>
+              <w:top w:type="dxa" w:w="40"/>
+              <w:left w:type="dxa" w:w="80"/>
+              <w:bottom w:type="dxa" w:w="40"/>
+              <w:right w:type="dxa" w:w="80"/>
+            </w:tcMar>
+          </w:tcPr>
+          <w:p>
+            <w:r>
+              <w:rPr>
+                <w:rFonts w:ascii="Cambria" w:cs="Cambria" w:eastAsia="Cambria" w:hAnsi="Cambria"/>
+                <w:b/>
+                <w:bCs/>
+                <w:sz w:val="17"/>
+                <w:szCs w:val="17"/>
+              </w:rPr>
+              <w:t xml:space="preserve">Restart control: hemisphere → restarted (mean ± SD)</w:t>
+            </w:r>
+          </w:p>
+        </w:tc>
+        <w:tc>
+          <w:tcPr>
+            <w:shd w:fill="DCE3EF" w:color="auto" w:val="clear"/>
+            <w:tcMar>
+              <w:top w:type="dxa" w:w="40"/>
+              <w:left w:type="dxa" w:w="80"/>
+              <w:bottom w:type="dxa" w:w="40"/>
+              <w:right w:type="dxa" w:w="80"/>
+            </w:tcMar>
+          </w:tcPr>
+          <w:p>
+            <w:r>
+              <w:rPr>
+                <w:rFonts w:ascii="Cambria" w:cs="Cambria" w:eastAsia="Cambria" w:hAnsi="Cambria"/>
+                <w:b/>
+                <w:bCs/>
+                <w:sz w:val="17"/>
+                <w:szCs w:val="17"/>
+              </w:rPr>
+              <w:t xml:space="preserve">Gain, </w:t>
+            </w:r>
+            <w:r>
+              <w:rPr>
+                <w:rFonts w:ascii="Cambria" w:cs="Cambria" w:eastAsia="Cambria" w:hAnsi="Cambria"/>
+                <w:b/>
+                <w:bCs/>
+                <w:i/>
+                <w:iCs/>
+                <w:sz w:val="17"/>
+                <w:szCs w:val="17"/>
+              </w:rPr>
+              <w:t xml:space="preserve">t</w:t>
+            </w:r>
+          </w:p>
+        </w:tc>
+      </w:tr>
+      <w:tr>
+        <w:trPr>
+          <w:tblHeader w:val="false"/>
+        </w:trPr>
+        <w:tc>
+          <w:tcPr>
+            <w:tcMar>
+              <w:top w:type="dxa" w:w="40"/>
+              <w:left w:type="dxa" w:w="80"/>
+              <w:bottom w:type="dxa" w:w="40"/>
+              <w:right w:type="dxa" w:w="80"/>
+            </w:tcMar>
+          </w:tcPr>
+          <w:p>
+            <w:r>
+              <w:rPr>
+                <w:rFonts w:ascii="Cambria" w:cs="Cambria" w:eastAsia="Cambria" w:hAnsi="Cambria"/>
+                <w:b w:val="false"/>
+                <w:bCs w:val="false"/>
+                <w:sz w:val="17"/>
+                <w:szCs w:val="17"/>
+              </w:rPr>
+              <w:t xml:space="preserve">0–20°</w:t>
+            </w:r>
+          </w:p>
+        </w:tc>
+        <w:tc>
+          <w:tcPr>
+            <w:tcMar>
+              <w:top w:type="dxa" w:w="40"/>
+              <w:left w:type="dxa" w:w="80"/>
+              <w:bottom w:type="dxa" w:w="40"/>
+              <w:right w:type="dxa" w:w="80"/>
+            </w:tcMar>
+          </w:tcPr>
+          <w:p>
+            <w:r>
+              <w:rPr>
+                <w:rFonts w:ascii="Cambria" w:cs="Cambria" w:eastAsia="Cambria" w:hAnsi="Cambria"/>
+                <w:b w:val="false"/>
+                <w:bCs w:val="false"/>
+                <w:sz w:val="17"/>
+                <w:szCs w:val="17"/>
+              </w:rPr>
+              <w:t xml:space="preserve">0.06682</w:t>
+            </w:r>
+          </w:p>
+        </w:tc>
+        <w:tc>
+          <w:tcPr>
+            <w:tcMar>
+              <w:top w:type="dxa" w:w="40"/>
+              <w:left w:type="dxa" w:w="80"/>
+              <w:bottom w:type="dxa" w:w="40"/>
+              <w:right w:type="dxa" w:w="80"/>
+            </w:tcMar>
+          </w:tcPr>
+          <w:p>
+            <w:r>
+              <w:rPr>
+                <w:rFonts w:ascii="Cambria" w:cs="Cambria" w:eastAsia="Cambria" w:hAnsi="Cambria"/>
+                <w:b w:val="false"/>
+                <w:bCs w:val="false"/>
+                <w:sz w:val="17"/>
+                <w:szCs w:val="17"/>
+              </w:rPr>
+              <w:t xml:space="preserve">0.06699</w:t>
+            </w:r>
+          </w:p>
+        </w:tc>
+        <w:tc>
+          <w:tcPr>
+            <w:tcMar>
+              <w:top w:type="dxa" w:w="40"/>
+              <w:left w:type="dxa" w:w="80"/>
+              <w:bottom w:type="dxa" w:w="40"/>
+              <w:right w:type="dxa" w:w="80"/>
+            </w:tcMar>
+          </w:tcPr>
+          <w:p>
+            <w:r>
+              <w:rPr>
+                <w:rFonts w:ascii="Cambria" w:cs="Cambria" w:eastAsia="Cambria" w:hAnsi="Cambria"/>
+                <w:b w:val="false"/>
+                <w:bCs w:val="false"/>
+                <w:sz w:val="17"/>
+                <w:szCs w:val="17"/>
+              </w:rPr>
+              <w:t xml:space="preserve">restart control</w:t>
+            </w:r>
+          </w:p>
+        </w:tc>
+        <w:tc>
+          <w:tcPr>
+            <w:tcMar>
+              <w:top w:type="dxa" w:w="40"/>
+              <w:left w:type="dxa" w:w="80"/>
+              <w:bottom w:type="dxa" w:w="40"/>
+              <w:right w:type="dxa" w:w="80"/>
+            </w:tcMar>
+          </w:tcPr>
+          <w:p>
+            <w:r>
+              <w:rPr>
+                <w:rFonts w:ascii="Cambria" w:cs="Cambria" w:eastAsia="Cambria" w:hAnsi="Cambria"/>
+                <w:b w:val="false"/>
+                <w:bCs w:val="false"/>
+                <w:sz w:val="17"/>
+                <w:szCs w:val="17"/>
+              </w:rPr>
+              <w:t xml:space="preserve">1.003</w:t>
+            </w:r>
+          </w:p>
+        </w:tc>
+        <w:tc>
+          <w:tcPr>
+            <w:tcMar>
+              <w:top w:type="dxa" w:w="40"/>
+              <w:left w:type="dxa" w:w="80"/>
+              <w:bottom w:type="dxa" w:w="40"/>
+              <w:right w:type="dxa" w:w="80"/>
+            </w:tcMar>
+          </w:tcPr>
+          <w:p>
+            <w:r>
+              <w:rPr>
+                <w:rFonts w:ascii="Cambria" w:cs="Cambria" w:eastAsia="Cambria" w:hAnsi="Cambria"/>
+                <w:b w:val="false"/>
+                <w:bCs w:val="false"/>
+                <w:sz w:val="17"/>
+                <w:szCs w:val="17"/>
+              </w:rPr>
+              <w:t xml:space="preserve">0.06677 ± 0.00017 → 0.06699 ± 0.00013</w:t>
+            </w:r>
+          </w:p>
+        </w:tc>
+        <w:tc>
+          <w:tcPr>
+            <w:tcMar>
+              <w:top w:type="dxa" w:w="40"/>
+              <w:left w:type="dxa" w:w="80"/>
+              <w:bottom w:type="dxa" w:w="40"/>
+              <w:right w:type="dxa" w:w="80"/>
+            </w:tcMar>
+          </w:tcPr>
+          <w:p>
+            <w:r>
+              <w:rPr>
+                <w:rFonts w:ascii="Cambria" w:cs="Cambria" w:eastAsia="Cambria" w:hAnsi="Cambria"/>
+                <w:b w:val="false"/>
+                <w:bCs w:val="false"/>
+                <w:sz w:val="17"/>
+                <w:szCs w:val="17"/>
+              </w:rPr>
+              <w:t xml:space="preserve">+0.32%, 1.7</w:t>
+            </w:r>
+          </w:p>
+        </w:tc>
+      </w:tr>
+      <w:tr>
+        <w:trPr>
+          <w:tblHeader w:val="false"/>
+        </w:trPr>
+        <w:tc>
+          <w:tcPr>
+            <w:tcMar>
+              <w:top w:type="dxa" w:w="40"/>
+              <w:left w:type="dxa" w:w="80"/>
+              <w:bottom w:type="dxa" w:w="40"/>
+              <w:right w:type="dxa" w:w="80"/>
+            </w:tcMar>
+          </w:tcPr>
+          <w:p>
+            <w:r>
+              <w:rPr>
+                <w:rFonts w:ascii="Cambria" w:cs="Cambria" w:eastAsia="Cambria" w:hAnsi="Cambria"/>
+                <w:b w:val="false"/>
+                <w:bCs w:val="false"/>
+                <w:sz w:val="17"/>
+                <w:szCs w:val="17"/>
+              </w:rPr>
+              <w:t xml:space="preserve">20–40°</w:t>
+            </w:r>
+          </w:p>
+        </w:tc>
+        <w:tc>
+          <w:tcPr>
+            <w:tcMar>
+              <w:top w:type="dxa" w:w="40"/>
+              <w:left w:type="dxa" w:w="80"/>
+              <w:bottom w:type="dxa" w:w="40"/>
+              <w:right w:type="dxa" w:w="80"/>
+            </w:tcMar>
+          </w:tcPr>
+          <w:p>
+            <w:r>
+              <w:rPr>
+                <w:rFonts w:ascii="Cambria" w:cs="Cambria" w:eastAsia="Cambria" w:hAnsi="Cambria"/>
+                <w:b w:val="false"/>
+                <w:bCs w:val="false"/>
+                <w:sz w:val="17"/>
+                <w:szCs w:val="17"/>
+              </w:rPr>
+              <w:t xml:space="preserve">0.16591</w:t>
+            </w:r>
+          </w:p>
+        </w:tc>
+        <w:tc>
+          <w:tcPr>
+            <w:tcMar>
+              <w:top w:type="dxa" w:w="40"/>
+              <w:left w:type="dxa" w:w="80"/>
+              <w:bottom w:type="dxa" w:w="40"/>
+              <w:right w:type="dxa" w:w="80"/>
+            </w:tcMar>
+          </w:tcPr>
+          <w:p>
+            <w:r>
+              <w:rPr>
+                <w:rFonts w:ascii="Cambria" w:cs="Cambria" w:eastAsia="Cambria" w:hAnsi="Cambria"/>
+                <w:b w:val="false"/>
+                <w:bCs w:val="false"/>
+                <w:sz w:val="17"/>
+                <w:szCs w:val="17"/>
+              </w:rPr>
+              <w:t xml:space="preserve">0.16628</w:t>
+            </w:r>
+          </w:p>
+        </w:tc>
+        <w:tc>
+          <w:tcPr>
+            <w:tcMar>
+              <w:top w:type="dxa" w:w="40"/>
+              <w:left w:type="dxa" w:w="80"/>
+              <w:bottom w:type="dxa" w:w="40"/>
+              <w:right w:type="dxa" w:w="80"/>
+            </w:tcMar>
+          </w:tcPr>
+          <w:p>
+            <w:r>
+              <w:rPr>
+                <w:rFonts w:ascii="Cambria" w:cs="Cambria" w:eastAsia="Cambria" w:hAnsi="Cambria"/>
+                <w:b w:val="false"/>
+                <w:bCs w:val="false"/>
+                <w:sz w:val="17"/>
+                <w:szCs w:val="17"/>
+              </w:rPr>
+              <w:t xml:space="preserve">restart control</w:t>
+            </w:r>
+          </w:p>
+        </w:tc>
+        <w:tc>
+          <w:tcPr>
+            <w:tcMar>
+              <w:top w:type="dxa" w:w="40"/>
+              <w:left w:type="dxa" w:w="80"/>
+              <w:bottom w:type="dxa" w:w="40"/>
+              <w:right w:type="dxa" w:w="80"/>
+            </w:tcMar>
+          </w:tcPr>
+          <w:p>
+            <w:r>
+              <w:rPr>
+                <w:rFonts w:ascii="Cambria" w:cs="Cambria" w:eastAsia="Cambria" w:hAnsi="Cambria"/>
+                <w:b w:val="false"/>
+                <w:bCs w:val="false"/>
+                <w:sz w:val="17"/>
+                <w:szCs w:val="17"/>
+              </w:rPr>
+              <w:t xml:space="preserve">1.002</w:t>
+            </w:r>
+          </w:p>
+        </w:tc>
+        <w:tc>
+          <w:tcPr>
+            <w:tcMar>
+              <w:top w:type="dxa" w:w="40"/>
+              <w:left w:type="dxa" w:w="80"/>
+              <w:bottom w:type="dxa" w:w="40"/>
+              <w:right w:type="dxa" w:w="80"/>
+            </w:tcMar>
+          </w:tcPr>
+          <w:p>
+            <w:r>
+              <w:rPr>
+                <w:rFonts w:ascii="Cambria" w:cs="Cambria" w:eastAsia="Cambria" w:hAnsi="Cambria"/>
+                <w:b w:val="false"/>
+                <w:bCs w:val="false"/>
+                <w:sz w:val="17"/>
+                <w:szCs w:val="17"/>
+              </w:rPr>
+              <w:t xml:space="preserve">0.16595 ± 0.00017 → 0.16628 ± 0.00020</w:t>
+            </w:r>
+          </w:p>
+        </w:tc>
+        <w:tc>
+          <w:tcPr>
+            <w:tcMar>
+              <w:top w:type="dxa" w:w="40"/>
+              <w:left w:type="dxa" w:w="80"/>
+              <w:bottom w:type="dxa" w:w="40"/>
+              <w:right w:type="dxa" w:w="80"/>
+            </w:tcMar>
+          </w:tcPr>
+          <w:p>
+            <w:r>
+              <w:rPr>
+                <w:rFonts w:ascii="Cambria" w:cs="Cambria" w:eastAsia="Cambria" w:hAnsi="Cambria"/>
+                <w:b w:val="false"/>
+                <w:bCs w:val="false"/>
+                <w:sz w:val="17"/>
+                <w:szCs w:val="17"/>
+              </w:rPr>
+              <w:t xml:space="preserve">+0.20%, 2.1 (five repeats: +0.29%, 4.1)</w:t>
+            </w:r>
+          </w:p>
+        </w:tc>
+      </w:tr>
+      <w:tr>
+        <w:trPr>
+          <w:tblHeader w:val="false"/>
+        </w:trPr>
+        <w:tc>
+          <w:tcPr>
+            <w:tcMar>
+              <w:top w:type="dxa" w:w="40"/>
+              <w:left w:type="dxa" w:w="80"/>
+              <w:bottom w:type="dxa" w:w="40"/>
+              <w:right w:type="dxa" w:w="80"/>
+            </w:tcMar>
+          </w:tcPr>
+          <w:p>
+            <w:r>
+              <w:rPr>
+                <w:rFonts w:ascii="Cambria" w:cs="Cambria" w:eastAsia="Cambria" w:hAnsi="Cambria"/>
+                <w:b w:val="false"/>
+                <w:bCs w:val="false"/>
+                <w:sz w:val="17"/>
+                <w:szCs w:val="17"/>
+              </w:rPr>
+              <w:t xml:space="preserve">40–60°</w:t>
+            </w:r>
+          </w:p>
+        </w:tc>
+        <w:tc>
+          <w:tcPr>
+            <w:tcMar>
+              <w:top w:type="dxa" w:w="40"/>
+              <w:left w:type="dxa" w:w="80"/>
+              <w:bottom w:type="dxa" w:w="40"/>
+              <w:right w:type="dxa" w:w="80"/>
+            </w:tcMar>
+          </w:tcPr>
+          <w:p>
+            <w:r>
+              <w:rPr>
+                <w:rFonts w:ascii="Cambria" w:cs="Cambria" w:eastAsia="Cambria" w:hAnsi="Cambria"/>
+                <w:b w:val="false"/>
+                <w:bCs w:val="false"/>
+                <w:sz w:val="17"/>
+                <w:szCs w:val="17"/>
+              </w:rPr>
+              <w:t xml:space="preserve">0.18503</w:t>
+            </w:r>
+          </w:p>
+        </w:tc>
+        <w:tc>
+          <w:tcPr>
+            <w:tcMar>
+              <w:top w:type="dxa" w:w="40"/>
+              <w:left w:type="dxa" w:w="80"/>
+              <w:bottom w:type="dxa" w:w="40"/>
+              <w:right w:type="dxa" w:w="80"/>
+            </w:tcMar>
+          </w:tcPr>
+          <w:p>
+            <w:r>
+              <w:rPr>
+                <w:rFonts w:ascii="Cambria" w:cs="Cambria" w:eastAsia="Cambria" w:hAnsi="Cambria"/>
+                <w:b w:val="false"/>
+                <w:bCs w:val="false"/>
+                <w:sz w:val="17"/>
+                <w:szCs w:val="17"/>
+              </w:rPr>
+              <w:t xml:space="preserve">0.19802</w:t>
+            </w:r>
+          </w:p>
+        </w:tc>
+        <w:tc>
+          <w:tcPr>
+            <w:tcMar>
+              <w:top w:type="dxa" w:w="40"/>
+              <w:left w:type="dxa" w:w="80"/>
+              <w:bottom w:type="dxa" w:w="40"/>
+              <w:right w:type="dxa" w:w="80"/>
+            </w:tcMar>
+          </w:tcPr>
+          <w:p>
+            <w:r>
+              <w:rPr>
+                <w:rFonts w:ascii="Cambria" w:cs="Cambria" w:eastAsia="Cambria" w:hAnsi="Cambria"/>
+                <w:b w:val="false"/>
+                <w:bCs w:val="false"/>
+                <w:sz w:val="17"/>
+                <w:szCs w:val="17"/>
+              </w:rPr>
+              <w:t xml:space="preserve">per-band campaign</w:t>
+            </w:r>
+          </w:p>
+        </w:tc>
+        <w:tc>
+          <w:tcPr>
+            <w:tcMar>
+              <w:top w:type="dxa" w:w="40"/>
+              <w:left w:type="dxa" w:w="80"/>
+              <w:bottom w:type="dxa" w:w="40"/>
+              <w:right w:type="dxa" w:w="80"/>
+            </w:tcMar>
+          </w:tcPr>
+          <w:p>
+            <w:r>
+              <w:rPr>
+                <w:rFonts w:ascii="Cambria" w:cs="Cambria" w:eastAsia="Cambria" w:hAnsi="Cambria"/>
+                <w:b w:val="false"/>
+                <w:bCs w:val="false"/>
+                <w:sz w:val="17"/>
+                <w:szCs w:val="17"/>
+              </w:rPr>
+              <w:t xml:space="preserve">1.070</w:t>
+            </w:r>
+          </w:p>
+        </w:tc>
+        <w:tc>
+          <w:tcPr>
+            <w:tcMar>
+              <w:top w:type="dxa" w:w="40"/>
+              <w:left w:type="dxa" w:w="80"/>
+              <w:bottom w:type="dxa" w:w="40"/>
+              <w:right w:type="dxa" w:w="80"/>
+            </w:tcMar>
+          </w:tcPr>
+          <w:p>
+            <w:r>
+              <w:rPr>
+                <w:rFonts w:ascii="Cambria" w:cs="Cambria" w:eastAsia="Cambria" w:hAnsi="Cambria"/>
+                <w:b w:val="false"/>
+                <w:bCs w:val="false"/>
+                <w:sz w:val="17"/>
+                <w:szCs w:val="17"/>
+              </w:rPr>
+              <w:t xml:space="preserve">0.18486 ± 0.00008 → 0.19355 ± 0.00010</w:t>
+            </w:r>
+          </w:p>
+        </w:tc>
+        <w:tc>
+          <w:tcPr>
+            <w:tcMar>
+              <w:top w:type="dxa" w:w="40"/>
+              <w:left w:type="dxa" w:w="80"/>
+              <w:bottom w:type="dxa" w:w="40"/>
+              <w:right w:type="dxa" w:w="80"/>
+            </w:tcMar>
+          </w:tcPr>
+          <w:p>
+            <w:r>
+              <w:rPr>
+                <w:rFonts w:ascii="Cambria" w:cs="Cambria" w:eastAsia="Cambria" w:hAnsi="Cambria"/>
+                <w:b w:val="false"/>
+                <w:bCs w:val="false"/>
+                <w:sz w:val="17"/>
+                <w:szCs w:val="17"/>
+              </w:rPr>
+              <w:t xml:space="preserve">+4.70%, 115</w:t>
+            </w:r>
+          </w:p>
+        </w:tc>
+      </w:tr>
+      <w:tr>
+        <w:trPr>
+          <w:tblHeader w:val="false"/>
+        </w:trPr>
+        <w:tc>
+          <w:tcPr>
+            <w:tcMar>
+              <w:top w:type="dxa" w:w="40"/>
+              <w:left w:type="dxa" w:w="80"/>
+              <w:bottom w:type="dxa" w:w="40"/>
+              <w:right w:type="dxa" w:w="80"/>
+            </w:tcMar>
+          </w:tcPr>
+          <w:p>
+            <w:r>
+              <w:rPr>
+                <w:rFonts w:ascii="Cambria" w:cs="Cambria" w:eastAsia="Cambria" w:hAnsi="Cambria"/>
+                <w:b w:val="false"/>
+                <w:bCs w:val="false"/>
+                <w:sz w:val="17"/>
+                <w:szCs w:val="17"/>
+              </w:rPr>
+              <w:t xml:space="preserve">60–80°</w:t>
+            </w:r>
+          </w:p>
+        </w:tc>
+        <w:tc>
+          <w:tcPr>
+            <w:tcMar>
+              <w:top w:type="dxa" w:w="40"/>
+              <w:left w:type="dxa" w:w="80"/>
+              <w:bottom w:type="dxa" w:w="40"/>
+              <w:right w:type="dxa" w:w="80"/>
+            </w:tcMar>
+          </w:tcPr>
+          <w:p>
+            <w:r>
+              <w:rPr>
+                <w:rFonts w:ascii="Cambria" w:cs="Cambria" w:eastAsia="Cambria" w:hAnsi="Cambria"/>
+                <w:b w:val="false"/>
+                <w:bCs w:val="false"/>
+                <w:sz w:val="17"/>
+                <w:szCs w:val="17"/>
+              </w:rPr>
+              <w:t xml:space="preserve">0.13589</w:t>
+            </w:r>
+          </w:p>
+        </w:tc>
+        <w:tc>
+          <w:tcPr>
+            <w:tcMar>
+              <w:top w:type="dxa" w:w="40"/>
+              <w:left w:type="dxa" w:w="80"/>
+              <w:bottom w:type="dxa" w:w="40"/>
+              <w:right w:type="dxa" w:w="80"/>
+            </w:tcMar>
+          </w:tcPr>
+          <w:p>
+            <w:r>
+              <w:rPr>
+                <w:rFonts w:ascii="Cambria" w:cs="Cambria" w:eastAsia="Cambria" w:hAnsi="Cambria"/>
+                <w:b w:val="false"/>
+                <w:bCs w:val="false"/>
+                <w:sz w:val="17"/>
+                <w:szCs w:val="17"/>
+              </w:rPr>
+              <w:t xml:space="preserve">0.14075</w:t>
+            </w:r>
+          </w:p>
+        </w:tc>
+        <w:tc>
+          <w:tcPr>
+            <w:tcMar>
+              <w:top w:type="dxa" w:w="40"/>
+              <w:left w:type="dxa" w:w="80"/>
+              <w:bottom w:type="dxa" w:w="40"/>
+              <w:right w:type="dxa" w:w="80"/>
+            </w:tcMar>
+          </w:tcPr>
+          <w:p>
+            <w:r>
+              <w:rPr>
+                <w:rFonts w:ascii="Cambria" w:cs="Cambria" w:eastAsia="Cambria" w:hAnsi="Cambria"/>
+                <w:b w:val="false"/>
+                <w:bCs w:val="false"/>
+                <w:sz w:val="17"/>
+                <w:szCs w:val="17"/>
+              </w:rPr>
+              <w:t xml:space="preserve">restart control</w:t>
+            </w:r>
+          </w:p>
+        </w:tc>
+        <w:tc>
+          <w:tcPr>
+            <w:tcMar>
+              <w:top w:type="dxa" w:w="40"/>
+              <w:left w:type="dxa" w:w="80"/>
+              <w:bottom w:type="dxa" w:w="40"/>
+              <w:right w:type="dxa" w:w="80"/>
+            </w:tcMar>
+          </w:tcPr>
+          <w:p>
+            <w:r>
+              <w:rPr>
+                <w:rFonts w:ascii="Cambria" w:cs="Cambria" w:eastAsia="Cambria" w:hAnsi="Cambria"/>
+                <w:b w:val="false"/>
+                <w:bCs w:val="false"/>
+                <w:sz w:val="17"/>
+                <w:szCs w:val="17"/>
+              </w:rPr>
+              <w:t xml:space="preserve">1.036</w:t>
+            </w:r>
+          </w:p>
+        </w:tc>
+        <w:tc>
+          <w:tcPr>
+            <w:tcMar>
+              <w:top w:type="dxa" w:w="40"/>
+              <w:left w:type="dxa" w:w="80"/>
+              <w:bottom w:type="dxa" w:w="40"/>
+              <w:right w:type="dxa" w:w="80"/>
+            </w:tcMar>
+          </w:tcPr>
+          <w:p>
+            <w:r>
+              <w:rPr>
+                <w:rFonts w:ascii="Cambria" w:cs="Cambria" w:eastAsia="Cambria" w:hAnsi="Cambria"/>
+                <w:b w:val="false"/>
+                <w:bCs w:val="false"/>
+                <w:sz w:val="17"/>
+                <w:szCs w:val="17"/>
+              </w:rPr>
+              <w:t xml:space="preserve">0.13581 ± 0.00014 → 0.14075 ± 0.00025</w:t>
+            </w:r>
+          </w:p>
+        </w:tc>
+        <w:tc>
+          <w:tcPr>
+            <w:tcMar>
+              <w:top w:type="dxa" w:w="40"/>
+              <w:left w:type="dxa" w:w="80"/>
+              <w:bottom w:type="dxa" w:w="40"/>
+              <w:right w:type="dxa" w:w="80"/>
+            </w:tcMar>
+          </w:tcPr>
+          <w:p>
+            <w:r>
+              <w:rPr>
+                <w:rFonts w:ascii="Cambria" w:cs="Cambria" w:eastAsia="Cambria" w:hAnsi="Cambria"/>
+                <w:b w:val="false"/>
+                <w:bCs w:val="false"/>
+                <w:sz w:val="17"/>
+                <w:szCs w:val="17"/>
+              </w:rPr>
+              <w:t xml:space="preserve">+3.64%, 30</w:t>
+            </w:r>
+          </w:p>
+        </w:tc>
+      </w:tr>
+      <w:tr>
+        <w:trPr>
+          <w:tblHeader w:val="false"/>
+        </w:trPr>
+        <w:tc>
+          <w:tcPr>
+            <w:tcMar>
+              <w:top w:type="dxa" w:w="40"/>
+              <w:left w:type="dxa" w:w="80"/>
+              <w:bottom w:type="dxa" w:w="40"/>
+              <w:right w:type="dxa" w:w="80"/>
+            </w:tcMar>
+          </w:tcPr>
+          <w:p>
+            <w:r>
+              <w:rPr>
+                <w:rFonts w:ascii="Cambria" w:cs="Cambria" w:eastAsia="Cambria" w:hAnsi="Cambria"/>
+                <w:b w:val="false"/>
+                <w:bCs w:val="false"/>
+                <w:sz w:val="17"/>
+                <w:szCs w:val="17"/>
+              </w:rPr>
+              <w:t xml:space="preserve">Total EQE</w:t>
+            </w:r>
+          </w:p>
+        </w:tc>
+        <w:tc>
+          <w:tcPr>
+            <w:tcMar>
+              <w:top w:type="dxa" w:w="40"/>
+              <w:left w:type="dxa" w:w="80"/>
+              <w:bottom w:type="dxa" w:w="40"/>
+              <w:right w:type="dxa" w:w="80"/>
+            </w:tcMar>
+          </w:tcPr>
+          <w:p>
+            <w:r>
+              <w:rPr>
+                <w:rFonts w:ascii="Cambria" w:cs="Cambria" w:eastAsia="Cambria" w:hAnsi="Cambria"/>
+                <w:b w:val="false"/>
+                <w:bCs w:val="false"/>
+                <w:sz w:val="17"/>
+                <w:szCs w:val="17"/>
+              </w:rPr>
+              <w:t xml:space="preserve">0.54679</w:t>
+            </w:r>
+          </w:p>
+        </w:tc>
+        <w:tc>
+          <w:tcPr>
+            <w:tcMar>
+              <w:top w:type="dxa" w:w="40"/>
+              <w:left w:type="dxa" w:w="80"/>
+              <w:bottom w:type="dxa" w:w="40"/>
+              <w:right w:type="dxa" w:w="80"/>
+            </w:tcMar>
+          </w:tcPr>
+          <w:p>
+            <w:r>
+              <w:rPr>
+                <w:rFonts w:ascii="Cambria" w:cs="Cambria" w:eastAsia="Cambria" w:hAnsi="Cambria"/>
+                <w:b w:val="false"/>
+                <w:bCs w:val="false"/>
+                <w:sz w:val="17"/>
+                <w:szCs w:val="17"/>
+              </w:rPr>
+              <w:t xml:space="preserve">0.5539</w:t>
+            </w:r>
+          </w:p>
+        </w:tc>
+        <w:tc>
+          <w:tcPr>
+            <w:tcMar>
+              <w:top w:type="dxa" w:w="40"/>
+              <w:left w:type="dxa" w:w="80"/>
+              <w:bottom w:type="dxa" w:w="40"/>
+              <w:right w:type="dxa" w:w="80"/>
+            </w:tcMar>
+          </w:tcPr>
+          <w:p>
+            <w:r>
+              <w:rPr>
+                <w:rFonts w:ascii="Cambria" w:cs="Cambria" w:eastAsia="Cambria" w:hAnsi="Cambria"/>
+                <w:b w:val="false"/>
+                <w:bCs w:val="false"/>
+                <w:sz w:val="17"/>
+                <w:szCs w:val="17"/>
+              </w:rPr>
+              <w:t xml:space="preserve">dedicated total-EQE campaign</w:t>
+            </w:r>
+          </w:p>
+        </w:tc>
+        <w:tc>
+          <w:tcPr>
+            <w:tcMar>
+              <w:top w:type="dxa" w:w="40"/>
+              <w:left w:type="dxa" w:w="80"/>
+              <w:bottom w:type="dxa" w:w="40"/>
+              <w:right w:type="dxa" w:w="80"/>
+            </w:tcMar>
+          </w:tcPr>
+          <w:p>
+            <w:r>
+              <w:rPr>
+                <w:rFonts w:ascii="Cambria" w:cs="Cambria" w:eastAsia="Cambria" w:hAnsi="Cambria"/>
+                <w:b w:val="false"/>
+                <w:bCs w:val="false"/>
+                <w:sz w:val="17"/>
+                <w:szCs w:val="17"/>
+              </w:rPr>
+              <w:t xml:space="preserve">1.013</w:t>
+            </w:r>
+          </w:p>
+        </w:tc>
+        <w:tc>
+          <w:tcPr>
+            <w:tcMar>
+              <w:top w:type="dxa" w:w="40"/>
+              <w:left w:type="dxa" w:w="80"/>
+              <w:bottom w:type="dxa" w:w="40"/>
+              <w:right w:type="dxa" w:w="80"/>
+            </w:tcMar>
+          </w:tcPr>
+          <w:p>
+            <w:r>
+              <w:rPr>
+                <w:rFonts w:ascii="Cambria" w:cs="Cambria" w:eastAsia="Cambria" w:hAnsi="Cambria"/>
+                <w:b w:val="false"/>
+                <w:bCs w:val="false"/>
+                <w:sz w:val="17"/>
+                <w:szCs w:val="17"/>
+              </w:rPr>
+              <w:t xml:space="preserve">0.54679 ± 0.00013 → 0.55231 ± 0.00004</w:t>
+            </w:r>
+          </w:p>
+        </w:tc>
+        <w:tc>
+          <w:tcPr>
+            <w:tcMar>
+              <w:top w:type="dxa" w:w="40"/>
+              <w:left w:type="dxa" w:w="80"/>
+              <w:bottom w:type="dxa" w:w="40"/>
+              <w:right w:type="dxa" w:w="80"/>
+            </w:tcMar>
+          </w:tcPr>
+          <w:p>
+            <w:r>
+              <w:rPr>
+                <w:rFonts w:ascii="Cambria" w:cs="Cambria" w:eastAsia="Cambria" w:hAnsi="Cambria"/>
+                <w:b w:val="false"/>
+                <w:bCs w:val="false"/>
+                <w:sz w:val="17"/>
+                <w:szCs w:val="17"/>
+              </w:rPr>
+              <w:t xml:space="preserve">+1.01%, 69</w:t>
+            </w:r>
+          </w:p>
+        </w:tc>
+      </w:tr>
+    </w:tbl>
+    <w:p>
+      <w:pPr>
+        <w:spacing w:after="120"/>
+      </w:pPr>
+    </w:p>
+    <w:p>
+      <w:pPr>
+        <w:spacing w:after="140" w:line="276"/>
+        <w:jc w:val="both"/>
+      </w:pPr>
+      <w:r>
+        <w:rPr>
+          <w:rFonts w:ascii="Cambria" w:cs="Cambria" w:eastAsia="Cambria" w:hAnsi="Cambria"/>
+        </w:rPr>
         <w:t xml:space="preserve">The hemisphere is therefore not merely a convenient baseline. It is a practical near-optimum of this structural class. This does not mean the optimum is exactly hemispherical. The best profiles differ from one another, and the low-efficiency part of the design space is diverse. Near the top of the performance range, however, this diversity does not convert into meaningful extra efficiency or band power.</w:t>
       </w:r>
     </w:p>
@@ -1803,7 +3977,130 @@
         <w:rPr>
           <w:rFonts w:ascii="Cambria" w:cs="Cambria" w:eastAsia="Cambria" w:hAnsi="Cambria"/>
         </w:rPr>
-        <w:t xml:space="preserve">, Fig. 3a). This holds for random and optimized designs alike, across total EQE from 0.12 to 0.56. Every weight </w:t>
+        <w:t xml:space="preserve">, Fig. 3a). This holds for random and optimized designs alike, across total EQE from 0.12 to 0.56: the 114 random designs alone give </w:t>
+      </w:r>
+      <w:r>
+        <w:rPr>
+          <w:rFonts w:ascii="Cambria" w:cs="Cambria" w:eastAsia="Cambria" w:hAnsi="Cambria"/>
+          <w:i/>
+          <w:iCs/>
+        </w:rPr>
+        <w:t xml:space="preserve">R</w:t>
+      </w:r>
+      <w:r>
+        <w:rPr>
+          <w:rFonts w:ascii="Cambria" w:cs="Cambria" w:eastAsia="Cambria" w:hAnsi="Cambria"/>
+          <w:i/>
+          <w:iCs/>
+          <w:vertAlign w:val="superscript"/>
+        </w:rPr>
+        <w:t xml:space="preserve">2</w:t>
+      </w:r>
+      <w:r>
+        <w:rPr>
+          <w:rFonts w:ascii="Cambria" w:cs="Cambria" w:eastAsia="Cambria" w:hAnsi="Cambria"/>
+          <w:i/>
+          <w:iCs/>
+        </w:rPr>
+        <w:t xml:space="preserve"> = 0.967</w:t>
+      </w:r>
+      <w:r>
+        <w:rPr>
+          <w:rFonts w:ascii="Cambria" w:cs="Cambria" w:eastAsia="Cambria" w:hAnsi="Cambria"/>
+        </w:rPr>
+        <w:t xml:space="preserve">, so the collapse is not produced by correlated points along optimizer trajectories. Because </w:t>
+      </w:r>
+      <w:r>
+        <w:rPr>
+          <w:rFonts w:ascii="Cambria" w:cs="Cambria" w:eastAsia="Cambria" w:hAnsi="Cambria"/>
+          <w:i/>
+          <w:iCs/>
+        </w:rPr>
+        <w:t xml:space="preserve">EQE</w:t>
+      </w:r>
+      <w:r>
+        <w:rPr>
+          <w:rFonts w:ascii="Cambria" w:cs="Cambria" w:eastAsia="Cambria" w:hAnsi="Cambria"/>
+          <w:i/>
+          <w:iCs/>
+          <w:vertAlign w:val="subscript"/>
+        </w:rPr>
+        <w:t xml:space="preserve">40–60</w:t>
+      </w:r>
+      <w:r>
+        <w:rPr>
+          <w:rFonts w:ascii="Cambria" w:cs="Cambria" w:eastAsia="Cambria" w:hAnsi="Cambria"/>
+        </w:rPr>
+        <w:t xml:space="preserve"> is part of </w:t>
+      </w:r>
+      <w:r>
+        <w:rPr>
+          <w:rFonts w:ascii="Cambria" w:cs="Cambria" w:eastAsia="Cambria" w:hAnsi="Cambria"/>
+          <w:i/>
+          <w:iCs/>
+        </w:rPr>
+        <w:t xml:space="preserve">EQE</w:t>
+      </w:r>
+      <w:r>
+        <w:rPr>
+          <w:rFonts w:ascii="Cambria" w:cs="Cambria" w:eastAsia="Cambria" w:hAnsi="Cambria"/>
+          <w:i/>
+          <w:iCs/>
+          <w:vertAlign w:val="subscript"/>
+        </w:rPr>
+        <w:t xml:space="preserve">total</w:t>
+      </w:r>
+      <w:r>
+        <w:rPr>
+          <w:rFonts w:ascii="Cambria" w:cs="Cambria" w:eastAsia="Cambria" w:hAnsi="Cambria"/>
+        </w:rPr>
+        <w:t xml:space="preserve">, the substantive content of the collapse is that </w:t>
+      </w:r>
+      <w:r>
+        <w:rPr>
+          <w:rFonts w:ascii="Cambria" w:cs="Cambria" w:eastAsia="Cambria" w:hAnsi="Cambria"/>
+          <w:i/>
+          <w:iCs/>
+        </w:rPr>
+        <w:t xml:space="preserve">S</w:t>
+      </w:r>
+      <w:r>
+        <w:rPr>
+          <w:rFonts w:ascii="Cambria" w:cs="Cambria" w:eastAsia="Cambria" w:hAnsi="Cambria"/>
+          <w:i/>
+          <w:iCs/>
+          <w:vertAlign w:val="subscript"/>
+        </w:rPr>
+        <w:t xml:space="preserve">40–60</w:t>
+      </w:r>
+      <w:r>
+        <w:rPr>
+          <w:rFonts w:ascii="Cambria" w:cs="Cambria" w:eastAsia="Cambria" w:hAnsi="Cambria"/>
+        </w:rPr>
+        <w:t xml:space="preserve"> varies little; over all designs it stays within 0.336–0.375 (5–95%). The other bands collapse as well, with </w:t>
+      </w:r>
+      <w:r>
+        <w:rPr>
+          <w:rFonts w:ascii="Cambria" w:cs="Cambria" w:eastAsia="Cambria" w:hAnsi="Cambria"/>
+          <w:i/>
+          <w:iCs/>
+        </w:rPr>
+        <w:t xml:space="preserve">R</w:t>
+      </w:r>
+      <w:r>
+        <w:rPr>
+          <w:rFonts w:ascii="Cambria" w:cs="Cambria" w:eastAsia="Cambria" w:hAnsi="Cambria"/>
+          <w:i/>
+          <w:iCs/>
+          <w:vertAlign w:val="superscript"/>
+        </w:rPr>
+        <w:t xml:space="preserve">2</w:t>
+      </w:r>
+      <w:r>
+        <w:rPr>
+          <w:rFonts w:ascii="Cambria" w:cs="Cambria" w:eastAsia="Cambria" w:hAnsi="Cambria"/>
+        </w:rPr>
+        <w:t xml:space="preserve"> = 0.85, 0.93, and 0.77 for 0–20°, 20–40°, and 60–80° (slopes and intervals in Note S4). Every weight </w:t>
       </w:r>
       <w:r>
         <w:rPr>
@@ -1843,7 +4140,7 @@
         <w:rPr>
           <w:rFonts w:ascii="Cambria" w:cs="Cambria" w:eastAsia="Cambria" w:hAnsi="Cambria"/>
         </w:rPr>
-        <w:t xml:space="preserve">: what a design acquires when only efficiency is pushed. It is 0.094 / 0.278 / 0.361 / 0.236 for the four bands. The 10–90% spread is a few thousandths in each band. These twenty designs were located by four different single-band objectives, so the agreement is not an artifact of a shared objective. Compared with the Lambertian partition, the platform depletes the 0–20° band and enriches the 40–60° band.</w:t>
+        <w:t xml:space="preserve">: what a design acquires when only efficiency is pushed. It is 0.094 / 0.278 / 0.361 / 0.236 for the four bands. The 10–90% spread is a few thousandths in each band. These twenty designs were located by four different single-band objectives, so the agreement is not an artifact of a shared objective. Nor is it an artifact of the choice of twenty: the top-10, top-20, and top-50 medians and means differ by at most 0.003, and bootstrap 95% intervals are ±0.002–0.005 (Note S4). Compared with the Lambertian partition, the platform depletes the 0–20° band and enriches the 40–60° band.</w:t>
       </w:r>
     </w:p>
     <w:p>
@@ -1855,7 +4152,30 @@
         <w:rPr>
           <w:rFonts w:ascii="Cambria" w:cs="Cambria" w:eastAsia="Cambria" w:hAnsi="Cambria"/>
         </w:rPr>
-        <w:t xml:space="preserve">Band-dedicated optimization does move the composition, and we measure by how much (Fig. 3b). Selectivity rises by +27%, +8%, +1%, and +20% relative to the natural composition, but total EQE falls by 3%, 2%, 1%, and 11%. The two effects largely cancel. Referred to the natural composition at the best total EQE, the net band-power gains are 1.22, 1.05, 1.00, and 1.07 (decomposition in Note S4, Fig. S3). Two points follow. First, the 40–60° band, the natural target of a directional film, gains nothing: the most efficient design already maximizes it. Second, the largest gain is at 0–20°, the band the platform under-serves. Shape freedom restores a depleted direction better than it creates a new one.</w:t>
+        <w:t xml:space="preserve">Band-dedicated optimization does move the composition, and we measure by how much (Fig. 3b). Selectivity rises by +27%, +8%, +1%, and +20% relative to the natural composition, but total EQE falls by 3%, 2%, 1%, and 11%. The two effects largely cancel. Referred to the natural composition at the best total EQE, the net band-power gains are 1.22, 1.05, 1.00, and 1.07 (decomposition in Note S4, Fig. S3). Two points follow. First, the 40–60° band, the natural target of a directional film, gains nothing: the most efficient design already maximizes it. Second, the largest gain is at 0–20°, the band the platform under-serves. Shape freedom restores a depleted direction better than it creates a new one. Part of this displacement comes from the cavity rather than the lens, because the cavity thicknesses are optimized together with the lens. In the multi-pass model of Note S9, with one common cavity, the 60–80° lens raises </w:t>
+      </w:r>
+      <w:r>
+        <w:rPr>
+          <w:rFonts w:ascii="Cambria" w:cs="Cambria" w:eastAsia="Cambria" w:hAnsi="Cambria"/>
+          <w:i/>
+          <w:iCs/>
+        </w:rPr>
+        <w:t xml:space="preserve">S</w:t>
+      </w:r>
+      <w:r>
+        <w:rPr>
+          <w:rFonts w:ascii="Cambria" w:cs="Cambria" w:eastAsia="Cambria" w:hAnsi="Cambria"/>
+          <w:i/>
+          <w:iCs/>
+          <w:vertAlign w:val="subscript"/>
+        </w:rPr>
+        <w:t xml:space="preserve">60–80</w:t>
+      </w:r>
+      <w:r>
+        <w:rPr>
+          <w:rFonts w:ascii="Cambria" w:cs="Cambria" w:eastAsia="Cambria" w:hAnsi="Cambria"/>
+        </w:rPr>
+        <w:t xml:space="preserve"> by only about 0.005 over the hemisphere, whereas the 60–80° cavity alone raises it by about 0.06. The lens-only share of the steering is therefore even smaller than Fig. 3b suggests; a fixed-cavity LightTools control is in progress.</w:t>
       </w:r>
     </w:p>
     <w:p>
@@ -2121,7 +4441,7 @@
         <w:rPr>
           <w:rFonts w:ascii="Cambria" w:cs="Cambria" w:eastAsia="Cambria" w:hAnsi="Cambria"/>
         </w:rPr>
-        <w:t xml:space="preserve">We next ask whether the result depends on the array construction. We repeat the analysis for the inverted (concave) and the randomly assembled families (Fig. 4), using the same statistics, each computed from the family's own evaluation log. Three signatures of saturation recur in all three families:</w:t>
+        <w:t xml:space="preserve">We next ask whether the result depends on the array construction. We repeat the analysis for the inverted (concave) and the randomly assembled families (Fig. 4), using the same statistics, each computed from the family's own evaluation log. The concave family uses exactly the variable bounds and feasibility rules of Table 1. Three signatures of saturation recur in all three families:</w:t>
       </w:r>
     </w:p>
     <w:p>
@@ -2174,7 +4494,7 @@
         <w:rPr>
           <w:rFonts w:ascii="Cambria" w:cs="Cambria" w:eastAsia="Cambria" w:hAnsi="Cambria"/>
         </w:rPr>
-        <w:t xml:space="preserve"> is 0.94 for the convex per-band campaign, 0.94 for the concave family, and 0.84 for the random family (Fig. 4, left column).</w:t>
+        <w:t xml:space="preserve"> is 0.94 for the convex per-band campaign, 0.94 for the concave family, and 0.84 for the random family (Fig. 4, left column). The logs differ in sampling density and, for the random family, in fidelity, so we read these values only as evidence that the collapse recurs, not as a ranking of the families.</w:t>
       </w:r>
     </w:p>
     <w:p>
@@ -2432,7 +4752,7 @@
         <w:rPr>
           <w:rFonts w:ascii="Cambria" w:cs="Cambria" w:eastAsia="Cambria" w:hAnsi="Cambria"/>
         </w:rPr>
-        <w:t xml:space="preserve">Three considerations explain the saturation, and a fourth may explain the fixed composition.</w:t>
+        <w:t xml:space="preserve">Three considerations explain the saturation, and a fourth explains why the composition, and not only the efficiency, is fixed.</w:t>
       </w:r>
     </w:p>
     <w:p>
@@ -2497,7 +4817,7 @@
           <w:i/>
           <w:iCs/>
         </w:rPr>
-        <w:t xml:space="preserve">θ</w:t>
+        <w:t xml:space="preserve">tanθ</w:t>
       </w:r>
       <w:r>
         <w:rPr>
@@ -2554,13 +4874,36 @@
           <w:b/>
           <w:bCs/>
         </w:rPr>
-        <w:t xml:space="preserve">Angular filtering over many passes.</w:t>
-      </w:r>
-      <w:r>
-        <w:rPr>
-          <w:rFonts w:ascii="Cambria" w:cs="Cambria" w:eastAsia="Cambria" w:hAnsi="Cambria"/>
-        </w:rPr>
-        <w:t xml:space="preserve"> A fourth consideration may explain why the composition, and not only the efficiency, is fixed. A hemispherical MLA returns unextracted light largely at its incident angle rather than randomizing it. Its transmittance is high below about 60° of incidence in the substrate, peaks near 50–57°, and falls below 0.1 above about 72° [6]. Light that escapes after several passes has therefore been filtered by the same angular transmittance at every pass. This would tie the output composition to the transmission function of the array and the substrate, rather than to the source distribution or to fine details of the lens profile. We offer this as a plausible mechanism. A quantitative test with the angle-resolved multi-pass model of ref. [6] is left to future work.</w:t>
+        <w:t xml:space="preserve">Depletion of favourable angles.</w:t>
+      </w:r>
+      <w:r>
+        <w:rPr>
+          <w:rFonts w:ascii="Cambria" w:cs="Cambria" w:eastAsia="Cambria" w:hAnsi="Cambria"/>
+        </w:rPr>
+        <w:t xml:space="preserve"> A hemispherical MLA returns unextracted light largely at its incident angle [6]. Light at angles the lens transmits well therefore leaves in the first passes, and later passes see mostly light at angles it transmits poorly. We quantified this with the angle-resolved multi-pass model of ref. [6], using ray-traced BSDFs of the optimized lenses of this work (Note S9). For the hemispherical total-EQE design with the Al cathode, the escape probability falls from 0.43 in the first pass to 0.39, 0.35, and 0.31 in the next three. A lens shaped to favour one band only changes which angles are emptied first, so the gain from reshaping is bounded. To test this, we replaced the angle-preserving device reflection by one that resets the returned light to a Lambertian distribution at every pass. The escape probability then stays at 0.42. The total extraction rises by 2.7–5.5% (Al) and 1.2–3.0% (Ag) at a common cavity, but the differences between lenses shrink: the spread of extraction efficiency over the nine optimized lenses falls from 2.5% to 1%, and the spread of </w:t>
+      </w:r>
+      <w:r>
+        <w:rPr>
+          <w:rFonts w:ascii="Cambria" w:cs="Cambria" w:eastAsia="Cambria" w:hAnsi="Cambria"/>
+          <w:i/>
+          <w:iCs/>
+        </w:rPr>
+        <w:t xml:space="preserve">S</w:t>
+      </w:r>
+      <w:r>
+        <w:rPr>
+          <w:rFonts w:ascii="Cambria" w:cs="Cambria" w:eastAsia="Cambria" w:hAnsi="Cambria"/>
+          <w:i/>
+          <w:iCs/>
+          <w:vertAlign w:val="subscript"/>
+        </w:rPr>
+        <w:t xml:space="preserve">40–60</w:t>
+      </w:r>
+      <w:r>
+        <w:rPr>
+          <w:rFonts w:ascii="Cambria" w:cs="Cambria" w:eastAsia="Cambria" w:hAnsi="Cambria"/>
+        </w:rPr>
+        <w:t xml:space="preserve"> from 0.029 to 0.011. Breaking the angular memory of the returned light therefore does not restore leverage to the lens shape; it removes most of what remains.</w:t>
       </w:r>
     </w:p>
     <w:p>
@@ -2589,7 +4932,7 @@
         <w:rPr>
           <w:rFonts w:ascii="Cambria" w:cs="Cambria" w:eastAsia="Cambria" w:hAnsi="Cambria"/>
         </w:rPr>
-        <w:t xml:space="preserve">Saturation of the lens shape does not end light extraction. It changes which quantity is worth varying. Table 1 maps each target figure of merit to the lever that remains productive once the hemispherical benchmark has confirmed saturation.</w:t>
+        <w:t xml:space="preserve">Saturation of the lens shape does not end light extraction. It changes which quantity is worth varying. Table 3 maps each target figure of merit to the lever that remains productive once the hemispherical benchmark has confirmed saturation.</w:t>
       </w:r>
     </w:p>
     <w:p>
@@ -2603,7 +4946,7 @@
           <w:b/>
           <w:bCs/>
         </w:rPr>
-        <w:t xml:space="preserve">Table 1 | Design-route map after refractive-MLA saturation.</w:t>
+        <w:t xml:space="preserve">Table 3 | Design-route map after refractive-MLA saturation.</w:t>
       </w:r>
     </w:p>
     <w:tbl>
@@ -3252,29 +5595,29 @@
                 <w:sz w:val="17"/>
                 <w:szCs w:val="17"/>
               </w:rPr>
-              <w:t xml:space="preserve">Ideal filter 62.1% vs 29.1% planar at 10% loss; DBR 48.2% → 32.5% over 100 nm (Note S7)</w:t>
-            </w:r>
-          </w:p>
-        </w:tc>
-        <w:tc>
-          <w:tcPr>
-            <w:tcMar>
-              <w:top w:type="dxa" w:w="40"/>
-              <w:left w:type="dxa" w:w="80"/>
-              <w:bottom w:type="dxa" w:w="40"/>
-              <w:right w:type="dxa" w:w="80"/>
-            </w:tcMar>
-          </w:tcPr>
-          <w:p>
-            <w:r>
-              <w:rPr>
-                <w:rFonts w:ascii="Cambria" w:cs="Cambria" w:eastAsia="Cambria" w:hAnsi="Cambria"/>
-                <w:b w:val="false"/>
-                <w:bCs w:val="false"/>
-                <w:sz w:val="17"/>
-                <w:szCs w:val="17"/>
-              </w:rPr>
-              <w:t xml:space="preserve">Round-trip loss and source bandwidth</w:t>
+              <w:t xml:space="preserve">Ideal filter 62.1% vs 29.1% planar at 10% loss (52.2% vs 27.2% at 15%); DBR 48.2% → 32.5% over 100 nm (Note S7)</w:t>
+            </w:r>
+          </w:p>
+        </w:tc>
+        <w:tc>
+          <w:tcPr>
+            <w:tcMar>
+              <w:top w:type="dxa" w:w="40"/>
+              <w:left w:type="dxa" w:w="80"/>
+              <w:bottom w:type="dxa" w:w="40"/>
+              <w:right w:type="dxa" w:w="80"/>
+            </w:tcMar>
+          </w:tcPr>
+          <w:p>
+            <w:r>
+              <w:rPr>
+                <w:rFonts w:ascii="Cambria" w:cs="Cambria" w:eastAsia="Cambria" w:hAnsi="Cambria"/>
+                <w:b w:val="false"/>
+                <w:bCs w:val="false"/>
+                <w:sz w:val="17"/>
+                <w:szCs w:val="17"/>
+              </w:rPr>
+              <w:t xml:space="preserve">Round-trip loss, source bandwidth, and angle randomization of the returned light (Note S9)</w:t>
             </w:r>
           </w:p>
         </w:tc>
@@ -3477,7 +5820,7 @@
         <w:rPr>
           <w:rFonts w:ascii="Cambria" w:cs="Cambria" w:eastAsia="Cambria" w:hAnsi="Cambria"/>
         </w:rPr>
-        <w:t xml:space="preserve"> can provide the selectivity that a non-selective refractive film cannot. Here an exit-side filter reflects out-of-band light back toward the device for another attempt. The multi-pass framework and the central role of the round-trip loss are those of ref. [6]; we add only angular selectivity on the exit side. This filter differs from the low-loss auxiliary reflector of ref. [6], which sits behind the device and returns light without angular selection. The two are complementary: the filter selects the angle, and the low round-trip loss lets the rejected light survive enough passes to be redirected. In a single pass, non-selective layers deliver 33.7% of the escaping light into the 40–60° band. A Markov multi-pass model with an ideal angular filter and 10% round-trip loss raises the delivery into that band to 62.1% of generated power, against 29.1% for a planar non-selective reference. A realizable eight-pair dielectric multilayer gives 48.2% for a monochromatic source but only 32.5% over a 100 nm bandwidth (Note S7, Fig. S7). Round-trip loss and source bandwidth are therefore the practical limits of this route. This is a reference calculation that shows why angular selection must be paired with a low round-trip loss, not a device proposal.</w:t>
+        <w:t xml:space="preserve"> can provide the selectivity that a non-selective refractive film cannot. Here an exit-side filter reflects out-of-band light back toward the device for another attempt. The multi-pass framework and the central role of the round-trip loss are those of ref. [6]; we add only angular selectivity on the exit side. This filter differs from the low-loss auxiliary reflector of ref. [6], which sits behind the device and returns light without angular selection. The two are complementary: the filter selects the angle, and the low round-trip loss lets the rejected light survive enough passes to be redirected. The filter only helps if the rejected light changes angle before it returns: with an angle-preserving device reflection and an MLA that keeps the angle, rejected light comes back at the same angle and is rejected again (Note S9). In a single pass, non-selective layers deliver 33.7% of the escaping light into the 40–60° band. A Markov multi-pass model with an ideal angular filter, full angle randomization, and 10% round-trip loss raises the delivery into that band to 62.1% of generated power, against 29.1% for a planar non-selective reference; at the 15% loss of the Al platform the two values are 52.2% and 27.2%. A realizable eight-pair dielectric multilayer gives 48.2% for a monochromatic source but only 32.5% over a 100 nm bandwidth (Note S7, Fig. S7). Round-trip loss and source bandwidth are therefore the practical limits of this route. This is a reference calculation that shows why angular selection must be paired with a low round-trip loss, not a device proposal.</w:t>
       </w:r>
     </w:p>
     <w:p>
@@ -3514,7 +5857,7 @@
         <w:rPr>
           <w:rFonts w:ascii="Cambria" w:cs="Cambria" w:eastAsia="Cambria" w:hAnsi="Cambria"/>
         </w:rPr>
-        <w:t xml:space="preserve"> The platform uses an Al cathode, so its absolute EQEs lie in the loss-limited regime identified in ref. [6]. One might ask whether the saturation is simply this ceiling. It is not. The comparison is relative: both lens classes share the same stack, and the hemisphere sits at 0.547 against 0.554 for the freeform. The multi-pass picture also shows that the lossy regime favours shape freedom. In </w:t>
+        <w:t xml:space="preserve"> The platform uses an Al cathode with an ETL of index about 1.8, so its absolute EQEs lie in the loss-limited regime identified in ref. [6]. A low-index ETL in front of Al reduces the round-trip loss by total internal reflection, so this ceiling is specific to the conventional stack. One might ask whether the saturation is simply this ceiling. It is not. The comparison is relative: both lens classes share the same stack, and the hemisphere sits at 0.547 against 0.554 for the freeform. The multi-pass picture also shows that the lossy regime favours shape freedom. In </w:t>
       </w:r>
       <w:r>
         <w:rPr>
@@ -3650,7 +5993,7 @@
         <w:rPr>
           <w:rFonts w:ascii="Cambria" w:cs="Cambria" w:eastAsia="Cambria" w:hAnsi="Cambria"/>
         </w:rPr>
-        <w:t xml:space="preserve">The saturation statement covers three manufacturable external-film families at substrate-matched lens index. It does not cover internal arrays, scattering layers, or high-index films. A separate, differently constrained exploration with three-dimensional asymmetric lenslets is consistent with the result. That exploration used an Ag electrode, an anisotropic emitter cell, and 52 shape variables. Its asymmetric shapes moved the far-field centroid but did not reliably raise the absolute power in a target </w:t>
+        <w:t xml:space="preserve">The saturation statement covers three manufacturable external-film families at substrate-matched lens index. It does not cover internal arrays, scattering layers, or high-index films. A separate exploration with three-dimensional asymmetric lenslets, run under different constraints, is consistent with the result but is suggestive only. It used an Ag electrode, an anisotropic emitter cell, and 52 shape variables. Its asymmetric shapes moved the far-field centroid but did not reliably raise the absolute power in a target </w:t>
       </w:r>
       <w:r>
         <w:rPr>
@@ -3664,7 +6007,7 @@
         <w:rPr>
           <w:rFonts w:ascii="Cambria" w:cs="Cambria" w:eastAsia="Cambria" w:hAnsi="Cambria"/>
         </w:rPr>
-        <w:t xml:space="preserve"> window above the hemisphere. Because its stack and constraints differ, we report it only qualitatively (Note S8). Directional emission is possible with other elements, such as resonant structures, metasurfaces, and asymmetric prisms [14,17]; the result here concerns refractive lenslets only. Absolute EQE values at the 25 mm patch are lower bounds (Section 4.1), but ratios and comparisons are not affected. Finally, the simulated surfaces are ideal: there is no form error, misalignment, or lens-to-lens variation. Fabrication imperfections can only reduce whatever advantage a freeform profile holds over the hemisphere, so the near-null result is conservative.</w:t>
+        <w:t xml:space="preserve"> window above the hemisphere. Because its stack and constraints differ, we report it only qualitatively (Note S8) and draw no quantitative conclusion from it. Directional emission is possible with other elements, such as resonant structures, metasurfaces, and asymmetric prisms [14,17]; the result here concerns refractive lenslets only. Absolute EQE values at the 25 mm patch are lower bounds (Section 4.1), but ratios and comparisons are not affected. Finally, the simulated surfaces are ideal: there is no form error, misalignment, or lens-to-lens variation. Fabrication imperfections can only reduce whatever advantage a freeform profile holds over the hemisphere, so the near-null result is conservative. The saturation is a robust property of the validated pipeline and constraint set. The smallest residues, such as +0.29% at 20–40° or +1% in total EQE, lie within plausible model-form uncertainty (optical constants, dispersion, polarization averaging) and should be read as design-space margins, not as predicted experimental differences.</w:t>
       </w:r>
     </w:p>
     <w:p>

</xml_diff>